<commit_message>
feat: gemini api implementation for the lead research part
</commit_message>
<xml_diff>
--- a/templates/proposal-template.docx
+++ b/templates/proposal-template.docx
@@ -971,6 +971,17 @@
     </w:p>
     <w:p>
       <w:pPr>
+        <w:spacing w:after="200" w:before="300" w:lineRule="auto"/>
+        <w:rPr/>
+      </w:pPr>
+      <w:r>
+        <w:rPr>
+          <w:rtl w:val="0"/>
+        </w:rPr>
+      </w:r>
+    </w:p>
+    <w:p>
+      <w:pPr>
         <w:pStyle w:val="Heading2"/>
         <w:spacing w:after="200" w:before="300" w:lineRule="auto"/>
         <w:ind w:left="0" w:firstLine="0"/>
@@ -983,41 +994,8 @@
           <w:szCs w:val="32"/>
         </w:rPr>
       </w:pPr>
-      <w:bookmarkStart w:colFirst="0" w:colLast="0" w:name="_ietuug6sodqh" w:id="5"/>
+      <w:bookmarkStart w:colFirst="0" w:colLast="0" w:name="_fxgepm3xl9eb" w:id="5"/>
       <w:bookmarkEnd w:id="5"/>
-      <w:r>
-        <w:rPr>
-          <w:rtl w:val="0"/>
-        </w:rPr>
-      </w:r>
-    </w:p>
-    <w:p>
-      <w:pPr>
-        <w:spacing w:after="200" w:before="300" w:lineRule="auto"/>
-        <w:rPr/>
-      </w:pPr>
-      <w:r>
-        <w:rPr>
-          <w:rtl w:val="0"/>
-        </w:rPr>
-      </w:r>
-    </w:p>
-    <w:p>
-      <w:pPr>
-        <w:pStyle w:val="Heading2"/>
-        <w:spacing w:after="200" w:before="300" w:lineRule="auto"/>
-        <w:ind w:left="0" w:firstLine="0"/>
-        <w:rPr>
-          <w:rFonts w:ascii="Proxima Nova" w:cs="Proxima Nova" w:eastAsia="Proxima Nova" w:hAnsi="Proxima Nova"/>
-          <w:b w:val="1"/>
-          <w:bCs w:val="1"/>
-          <w:color w:val="f15a22"/>
-          <w:sz w:val="32"/>
-          <w:szCs w:val="32"/>
-        </w:rPr>
-      </w:pPr>
-      <w:bookmarkStart w:colFirst="0" w:colLast="0" w:name="_fxgepm3xl9eb" w:id="6"/>
-      <w:bookmarkEnd w:id="6"/>
       <w:r>
         <w:rPr>
           <w:rFonts w:ascii="Proxima Nova" w:cs="Proxima Nova" w:eastAsia="Proxima Nova" w:hAnsi="Proxima Nova"/>
@@ -1133,8 +1111,8 @@
           <w:szCs w:val="72"/>
         </w:rPr>
       </w:pPr>
-      <w:bookmarkStart w:colFirst="0" w:colLast="0" w:name="_e51yqoqgzv33" w:id="7"/>
-      <w:bookmarkEnd w:id="7"/>
+      <w:bookmarkStart w:colFirst="0" w:colLast="0" w:name="_e51yqoqgzv33" w:id="6"/>
+      <w:bookmarkEnd w:id="6"/>
       <w:r>
         <w:rPr>
           <w:rFonts w:ascii="Maven Pro" w:cs="Maven Pro" w:eastAsia="Maven Pro" w:hAnsi="Maven Pro"/>
@@ -1839,8 +1817,8 @@
           <w:szCs w:val="32"/>
         </w:rPr>
       </w:pPr>
-      <w:bookmarkStart w:colFirst="0" w:colLast="0" w:name="_8yyyowtuezyi" w:id="8"/>
-      <w:bookmarkEnd w:id="8"/>
+      <w:bookmarkStart w:colFirst="0" w:colLast="0" w:name="_8yyyowtuezyi" w:id="7"/>
+      <w:bookmarkEnd w:id="7"/>
       <w:r>
         <w:rPr>
           <w:rFonts w:ascii="Proxima Nova" w:cs="Proxima Nova" w:eastAsia="Proxima Nova" w:hAnsi="Proxima Nova"/>
@@ -1948,7 +1926,7 @@
           <w:ilvl w:val="0"/>
           <w:numId w:val="6"/>
         </w:numPr>
-        <w:spacing w:after="100" w:lineRule="auto"/>
+        <w:spacing w:after="0" w:lineRule="auto"/>
         <w:ind w:left="720" w:hanging="360"/>
         <w:rPr>
           <w:rFonts w:ascii="Proxima Nova" w:cs="Proxima Nova" w:eastAsia="Proxima Nova" w:hAnsi="Proxima Nova"/>
@@ -2306,57 +2284,52 @@
     </w:p>
     <w:p>
       <w:pPr>
-        <w:spacing w:after="140" w:lineRule="auto"/>
-        <w:ind w:left="283.46456692913375" w:firstLine="0"/>
-        <w:rPr>
-          <w:sz w:val="24"/>
-          <w:szCs w:val="24"/>
-        </w:rPr>
-      </w:pPr>
-      <w:r>
-        <w:rPr>
-          <w:rtl w:val="0"/>
-        </w:rPr>
-      </w:r>
-    </w:p>
-    <w:p>
-      <w:pPr>
-        <w:spacing w:after="140" w:lineRule="auto"/>
-        <w:ind w:left="283.46456692913375" w:firstLine="0"/>
-        <w:rPr>
-          <w:sz w:val="24"/>
-          <w:szCs w:val="24"/>
-        </w:rPr>
-      </w:pPr>
-      <w:r>
-        <w:rPr>
-          <w:rtl w:val="0"/>
-        </w:rPr>
-      </w:r>
-    </w:p>
-    <w:p>
-      <w:pPr>
-        <w:spacing w:after="140" w:lineRule="auto"/>
-        <w:ind w:left="283.46456692913375" w:firstLine="0"/>
-        <w:rPr>
-          <w:sz w:val="24"/>
-          <w:szCs w:val="24"/>
-        </w:rPr>
-      </w:pPr>
-      <w:r>
-        <w:rPr>
-          <w:rtl w:val="0"/>
-        </w:rPr>
-      </w:r>
-    </w:p>
-    <w:p>
-      <w:pPr>
-        <w:spacing w:after="140" w:lineRule="auto"/>
-        <w:ind w:left="283.46456692913375" w:firstLine="0"/>
-        <w:rPr>
-          <w:sz w:val="24"/>
-          <w:szCs w:val="24"/>
-        </w:rPr>
+        <w:spacing w:after="200" w:before="300" w:lineRule="auto"/>
+        <w:rPr/>
+      </w:pPr>
+      <w:r>
+        <w:rPr>
+          <w:rtl w:val="0"/>
+        </w:rPr>
+      </w:r>
+    </w:p>
+    <w:p>
+      <w:pPr>
+        <w:spacing w:after="200" w:before="300" w:lineRule="auto"/>
+        <w:rPr/>
+      </w:pPr>
+      <w:r>
+        <w:rPr>
+          <w:rtl w:val="0"/>
+        </w:rPr>
+      </w:r>
+    </w:p>
+    <w:p>
+      <w:pPr>
+        <w:spacing w:after="200" w:before="300" w:lineRule="auto"/>
+        <w:rPr/>
+      </w:pPr>
+      <w:r>
+        <w:rPr>
+          <w:rtl w:val="0"/>
+        </w:rPr>
+      </w:r>
+    </w:p>
+    <w:p>
+      <w:pPr>
+        <w:spacing w:after="200" w:before="300" w:lineRule="auto"/>
+        <w:rPr/>
+      </w:pPr>
+      <w:r>
+        <w:rPr>
+          <w:rtl w:val="0"/>
+        </w:rPr>
+      </w:r>
+    </w:p>
+    <w:p>
+      <w:pPr>
+        <w:spacing w:after="200" w:before="300" w:lineRule="auto"/>
+        <w:rPr/>
       </w:pPr>
       <w:r>
         <w:rPr>
@@ -2378,8 +2351,8 @@
           <w:szCs w:val="32"/>
         </w:rPr>
       </w:pPr>
-      <w:bookmarkStart w:colFirst="0" w:colLast="0" w:name="_ck9rfsvrni6f" w:id="9"/>
-      <w:bookmarkEnd w:id="9"/>
+      <w:bookmarkStart w:colFirst="0" w:colLast="0" w:name="_ck9rfsvrni6f" w:id="8"/>
+      <w:bookmarkEnd w:id="8"/>
       <w:r>
         <w:rPr>
           <w:rFonts w:ascii="Arial" w:cs="Arial" w:eastAsia="Arial" w:hAnsi="Arial"/>
@@ -2449,8 +2422,8 @@
           <w:color w:val="000000"/>
         </w:rPr>
       </w:pPr>
-      <w:bookmarkStart w:colFirst="0" w:colLast="0" w:name="_bcteyy5buqke" w:id="10"/>
-      <w:bookmarkEnd w:id="10"/>
+      <w:bookmarkStart w:colFirst="0" w:colLast="0" w:name="_bcteyy5buqke" w:id="9"/>
+      <w:bookmarkEnd w:id="9"/>
       <w:r>
         <w:rPr>
           <w:rFonts w:ascii="Proxima Nova" w:cs="Proxima Nova" w:eastAsia="Proxima Nova" w:hAnsi="Proxima Nova"/>
@@ -2620,7 +2593,7 @@
           <w:ilvl w:val="0"/>
           <w:numId w:val="3"/>
         </w:numPr>
-        <w:spacing w:after="60" w:before="0" w:lineRule="auto"/>
+        <w:spacing w:after="0" w:before="0" w:lineRule="auto"/>
         <w:ind w:left="720" w:hanging="360"/>
         <w:rPr>
           <w:rFonts w:ascii="Proxima Nova" w:cs="Proxima Nova" w:eastAsia="Proxima Nova" w:hAnsi="Proxima Nova"/>
@@ -2959,6 +2932,17 @@
           <w:sz w:val="24"/>
           <w:szCs w:val="24"/>
         </w:rPr>
+      </w:pPr>
+      <w:r>
+        <w:rPr>
+          <w:rtl w:val="0"/>
+        </w:rPr>
+      </w:r>
+    </w:p>
+    <w:p>
+      <w:pPr>
+        <w:spacing w:after="200" w:before="300" w:lineRule="auto"/>
+        <w:rPr/>
       </w:pPr>
       <w:r>
         <w:rPr>
@@ -2980,8 +2964,8 @@
           <w:szCs w:val="32"/>
         </w:rPr>
       </w:pPr>
-      <w:bookmarkStart w:colFirst="0" w:colLast="0" w:name="_ff8cv5bc3hdl" w:id="11"/>
-      <w:bookmarkEnd w:id="11"/>
+      <w:bookmarkStart w:colFirst="0" w:colLast="0" w:name="_ff8cv5bc3hdl" w:id="10"/>
+      <w:bookmarkEnd w:id="10"/>
       <w:r>
         <w:rPr>
           <w:rFonts w:ascii="Arial" w:cs="Arial" w:eastAsia="Arial" w:hAnsi="Arial"/>
@@ -3138,7 +3122,7 @@
           <w:ilvl w:val="0"/>
           <w:numId w:val="1"/>
         </w:numPr>
-        <w:spacing w:after="140" w:lineRule="auto"/>
+        <w:spacing w:after="0" w:lineRule="auto"/>
         <w:ind w:left="720" w:hanging="360"/>
         <w:rPr>
           <w:rFonts w:ascii="Proxima Nova" w:cs="Proxima Nova" w:eastAsia="Proxima Nova" w:hAnsi="Proxima Nova"/>
@@ -3243,7 +3227,6 @@
         <w:br w:type="textWrapping"/>
         <w:br w:type="textWrapping"/>
         <w:br w:type="textWrapping"/>
-        <w:br w:type="textWrapping"/>
       </w:r>
     </w:p>
     <w:p>
@@ -3372,6 +3355,18 @@
         <w:rPr>
           <w:rtl w:val="0"/>
         </w:rPr>
+      </w:r>
+    </w:p>
+    <w:p>
+      <w:pPr>
+        <w:spacing w:after="200" w:before="300" w:lineRule="auto"/>
+        <w:rPr/>
+      </w:pPr>
+      <w:r>
+        <w:rPr>
+          <w:rtl w:val="0"/>
+        </w:rPr>
+        <w:br w:type="textWrapping"/>
       </w:r>
     </w:p>
     <w:p>
@@ -3388,8 +3383,8 @@
           <w:szCs w:val="32"/>
         </w:rPr>
       </w:pPr>
-      <w:bookmarkStart w:colFirst="0" w:colLast="0" w:name="_ryx4sy8d1hkb" w:id="12"/>
-      <w:bookmarkEnd w:id="12"/>
+      <w:bookmarkStart w:colFirst="0" w:colLast="0" w:name="_ywg3u7tmzkj6" w:id="11"/>
+      <w:bookmarkEnd w:id="11"/>
       <w:r>
         <w:rPr>
           <w:rFonts w:ascii="Arial" w:cs="Arial" w:eastAsia="Arial" w:hAnsi="Arial"/>
@@ -3509,7 +3504,7 @@
           <w:ilvl w:val="0"/>
           <w:numId w:val="7"/>
         </w:numPr>
-        <w:spacing w:after="140" w:lineRule="auto"/>
+        <w:spacing w:after="0" w:lineRule="auto"/>
         <w:ind w:left="1133.858267716535" w:hanging="360"/>
         <w:rPr>
           <w:rFonts w:ascii="Proxima Nova" w:cs="Proxima Nova" w:eastAsia="Proxima Nova" w:hAnsi="Proxima Nova"/>
@@ -3901,6 +3896,33 @@
           <w:sz w:val="24"/>
           <w:szCs w:val="24"/>
         </w:rPr>
+      </w:pPr>
+      <w:r>
+        <w:rPr>
+          <w:rtl w:val="0"/>
+        </w:rPr>
+      </w:r>
+    </w:p>
+    <w:p>
+      <w:pPr>
+        <w:spacing w:after="140" w:lineRule="auto"/>
+        <w:ind w:left="420" w:firstLine="0"/>
+        <w:rPr>
+          <w:rFonts w:ascii="Proxima Nova" w:cs="Proxima Nova" w:eastAsia="Proxima Nova" w:hAnsi="Proxima Nova"/>
+          <w:sz w:val="24"/>
+          <w:szCs w:val="24"/>
+        </w:rPr>
+      </w:pPr>
+      <w:r>
+        <w:rPr>
+          <w:rtl w:val="0"/>
+        </w:rPr>
+      </w:r>
+    </w:p>
+    <w:p>
+      <w:pPr>
+        <w:spacing w:after="200" w:before="300" w:lineRule="auto"/>
+        <w:rPr/>
       </w:pPr>
       <w:r>
         <w:rPr>
@@ -3922,8 +3944,8 @@
           <w:szCs w:val="32"/>
         </w:rPr>
       </w:pPr>
-      <w:bookmarkStart w:colFirst="0" w:colLast="0" w:name="_5xegfi76coue" w:id="13"/>
-      <w:bookmarkEnd w:id="13"/>
+      <w:bookmarkStart w:colFirst="0" w:colLast="0" w:name="_5xegfi76coue" w:id="12"/>
+      <w:bookmarkEnd w:id="12"/>
       <w:r>
         <w:rPr>
           <w:rFonts w:ascii="Proxima Nova" w:cs="Proxima Nova" w:eastAsia="Proxima Nova" w:hAnsi="Proxima Nova"/>
@@ -3997,7 +4019,7 @@
           <w:szCs w:val="24"/>
           <w:rtl w:val="0"/>
         </w:rPr>
-        <w:t xml:space="preserve">building scalable digital business.</w:t>
+        <w:t xml:space="preserve">building scalable digital businesses.</w:t>
         <w:br w:type="textWrapping"/>
       </w:r>
       <w:r>
@@ -4163,7 +4185,7 @@
           <w:ilvl w:val="0"/>
           <w:numId w:val="2"/>
         </w:numPr>
-        <w:spacing w:after="140" w:lineRule="auto"/>
+        <w:spacing w:after="0" w:before="0" w:lineRule="auto"/>
         <w:ind w:left="1133.858267716535" w:hanging="360"/>
         <w:rPr>
           <w:rFonts w:ascii="Proxima Nova" w:cs="Proxima Nova" w:eastAsia="Proxima Nova" w:hAnsi="Proxima Nova"/>
@@ -4256,6 +4278,22 @@
           <w:rtl w:val="0"/>
         </w:rPr>
         <w:t xml:space="preserve">{/show_whyChooseUs}</w:t>
+      </w:r>
+    </w:p>
+    <w:p>
+      <w:pPr>
+        <w:spacing w:after="140" w:lineRule="auto"/>
+        <w:ind w:left="420" w:firstLine="0"/>
+        <w:rPr>
+          <w:rFonts w:ascii="Proxima Nova" w:cs="Proxima Nova" w:eastAsia="Proxima Nova" w:hAnsi="Proxima Nova"/>
+          <w:sz w:val="24"/>
+          <w:szCs w:val="24"/>
+        </w:rPr>
+      </w:pPr>
+      <w:r>
+        <w:rPr>
+          <w:rtl w:val="0"/>
+        </w:rPr>
       </w:r>
     </w:p>
     <w:p>
@@ -4464,8 +4502,8 @@
           <w:szCs w:val="32"/>
         </w:rPr>
       </w:pPr>
-      <w:bookmarkStart w:colFirst="0" w:colLast="0" w:name="_edltim97o344" w:id="14"/>
-      <w:bookmarkEnd w:id="14"/>
+      <w:bookmarkStart w:colFirst="0" w:colLast="0" w:name="_edltim97o344" w:id="13"/>
+      <w:bookmarkEnd w:id="13"/>
       <w:r>
         <w:rPr>
           <w:rFonts w:ascii="Arial" w:cs="Arial" w:eastAsia="Arial" w:hAnsi="Arial"/>
@@ -4581,7 +4619,7 @@
           <w:ilvl w:val="0"/>
           <w:numId w:val="9"/>
         </w:numPr>
-        <w:spacing w:after="140" w:lineRule="auto"/>
+        <w:spacing w:after="0" w:lineRule="auto"/>
         <w:ind w:left="1133.858267716535" w:hanging="360"/>
         <w:rPr>
           <w:rFonts w:ascii="Proxima Nova" w:cs="Proxima Nova" w:eastAsia="Proxima Nova" w:hAnsi="Proxima Nova"/>
@@ -4722,6 +4760,16 @@
         <w:br w:type="textWrapping"/>
         <w:br w:type="textWrapping"/>
         <w:br w:type="textWrapping"/>
+      </w:r>
+    </w:p>
+    <w:p>
+      <w:pPr>
+        <w:rPr/>
+      </w:pPr>
+      <w:r>
+        <w:rPr>
+          <w:rtl w:val="0"/>
+        </w:rPr>
       </w:r>
     </w:p>
     <w:p>
@@ -4806,8 +4854,8 @@
           <w:szCs w:val="32"/>
         </w:rPr>
       </w:pPr>
-      <w:bookmarkStart w:colFirst="0" w:colLast="0" w:name="_gasa49glhofo" w:id="15"/>
-      <w:bookmarkEnd w:id="15"/>
+      <w:bookmarkStart w:colFirst="0" w:colLast="0" w:name="_gasa49glhofo" w:id="14"/>
+      <w:bookmarkEnd w:id="14"/>
       <w:r>
         <w:rPr>
           <w:rFonts w:ascii="Arial" w:cs="Arial" w:eastAsia="Arial" w:hAnsi="Arial"/>
@@ -4921,7 +4969,7 @@
           <w:ilvl w:val="0"/>
           <w:numId w:val="4"/>
         </w:numPr>
-        <w:spacing w:after="140" w:lineRule="auto"/>
+        <w:spacing w:after="0" w:lineRule="auto"/>
         <w:ind w:left="1133.858267716535" w:hanging="360"/>
         <w:rPr>
           <w:rFonts w:ascii="Proxima Nova" w:cs="Proxima Nova" w:eastAsia="Proxima Nova" w:hAnsi="Proxima Nova"/>
@@ -5141,8 +5189,8 @@
           <w:szCs w:val="32"/>
         </w:rPr>
       </w:pPr>
-      <w:bookmarkStart w:colFirst="0" w:colLast="0" w:name="_s6g1n2u0cbn3" w:id="16"/>
-      <w:bookmarkEnd w:id="16"/>
+      <w:bookmarkStart w:colFirst="0" w:colLast="0" w:name="_s6g1n2u0cbn3" w:id="15"/>
+      <w:bookmarkEnd w:id="15"/>
       <w:r>
         <w:rPr>
           <w:rFonts w:ascii="Arial" w:cs="Arial" w:eastAsia="Arial" w:hAnsi="Arial"/>
@@ -5760,8 +5808,8 @@
           <w:szCs w:val="32"/>
         </w:rPr>
       </w:pPr>
-      <w:bookmarkStart w:colFirst="0" w:colLast="0" w:name="_ifw8m628egut" w:id="17"/>
-      <w:bookmarkEnd w:id="17"/>
+      <w:bookmarkStart w:colFirst="0" w:colLast="0" w:name="_ifw8m628egut" w:id="16"/>
+      <w:bookmarkEnd w:id="16"/>
       <w:r>
         <w:rPr>
           <w:rFonts w:ascii="Arial" w:cs="Arial" w:eastAsia="Arial" w:hAnsi="Arial"/>
@@ -6271,8 +6319,8 @@
           <w:szCs w:val="32"/>
         </w:rPr>
       </w:pPr>
-      <w:bookmarkStart w:colFirst="0" w:colLast="0" w:name="_ymrf9jpsgt4" w:id="18"/>
-      <w:bookmarkEnd w:id="18"/>
+      <w:bookmarkStart w:colFirst="0" w:colLast="0" w:name="_ymrf9jpsgt4" w:id="17"/>
+      <w:bookmarkEnd w:id="17"/>
       <w:r>
         <w:rPr>
           <w:rFonts w:ascii="Arial" w:cs="Arial" w:eastAsia="Arial" w:hAnsi="Arial"/>
@@ -6392,7 +6440,7 @@
           <w:ilvl w:val="0"/>
           <w:numId w:val="5"/>
         </w:numPr>
-        <w:spacing w:after="140" w:lineRule="auto"/>
+        <w:spacing w:after="0" w:lineRule="auto"/>
         <w:ind w:left="1133.858267716535" w:hanging="360"/>
         <w:rPr>
           <w:rFonts w:ascii="Proxima Nova" w:cs="Proxima Nova" w:eastAsia="Proxima Nova" w:hAnsi="Proxima Nova"/>
@@ -6476,7 +6524,7 @@
           <w:ilvl w:val="0"/>
           <w:numId w:val="10"/>
         </w:numPr>
-        <w:spacing w:after="140" w:lineRule="auto"/>
+        <w:spacing w:after="0" w:lineRule="auto"/>
         <w:ind w:left="1133.858267716535" w:hanging="360"/>
         <w:rPr>
           <w:rFonts w:ascii="Proxima Nova" w:cs="Proxima Nova" w:eastAsia="Proxima Nova" w:hAnsi="Proxima Nova"/>
@@ -6589,7 +6637,7 @@
           <w:ilvl w:val="0"/>
           <w:numId w:val="8"/>
         </w:numPr>
-        <w:spacing w:after="140" w:lineRule="auto"/>
+        <w:spacing w:after="0" w:lineRule="auto"/>
         <w:ind w:left="1133.858267716535" w:hanging="360"/>
         <w:rPr>
           <w:rFonts w:ascii="Proxima Nova" w:cs="Proxima Nova" w:eastAsia="Proxima Nova" w:hAnsi="Proxima Nova"/>

</xml_diff>

<commit_message>
fix: template of the scope doc formatting
</commit_message>
<xml_diff>
--- a/templates/proposal-template.docx
+++ b/templates/proposal-template.docx
@@ -359,128 +359,12 @@
     <w:p>
       <w:pPr>
         <w:spacing w:after="0" w:lineRule="auto"/>
-        <w:ind w:left="566.9291338582675" w:firstLine="0"/>
+        <w:ind w:left="0" w:firstLine="0"/>
         <w:rPr>
           <w:rFonts w:ascii="Proxima Nova" w:cs="Proxima Nova" w:eastAsia="Proxima Nova" w:hAnsi="Proxima Nova"/>
           <w:b w:val="1"/>
           <w:bCs w:val="1"/>
           <w:color w:val="5a6a7a"/>
-          <w:sz w:val="24"/>
-          <w:szCs w:val="24"/>
-        </w:rPr>
-      </w:pPr>
-      <w:r>
-        <w:rPr>
-          <w:rtl w:val="0"/>
-        </w:rPr>
-      </w:r>
-    </w:p>
-    <w:p>
-      <w:pPr>
-        <w:spacing w:after="0" w:lineRule="auto"/>
-        <w:ind w:left="566.9291338582675" w:firstLine="0"/>
-        <w:rPr>
-          <w:rFonts w:ascii="Proxima Nova" w:cs="Proxima Nova" w:eastAsia="Proxima Nova" w:hAnsi="Proxima Nova"/>
-          <w:b w:val="1"/>
-          <w:bCs w:val="1"/>
-          <w:color w:val="5a6a7a"/>
-          <w:sz w:val="24"/>
-          <w:szCs w:val="24"/>
-        </w:rPr>
-      </w:pPr>
-      <w:r>
-        <w:rPr>
-          <w:rtl w:val="0"/>
-        </w:rPr>
-      </w:r>
-    </w:p>
-    <w:p>
-      <w:pPr>
-        <w:spacing w:after="0" w:lineRule="auto"/>
-        <w:ind w:left="566.9291338582675" w:firstLine="0"/>
-        <w:rPr>
-          <w:rFonts w:ascii="Proxima Nova" w:cs="Proxima Nova" w:eastAsia="Proxima Nova" w:hAnsi="Proxima Nova"/>
-          <w:b w:val="1"/>
-          <w:bCs w:val="1"/>
-          <w:color w:val="5a6a7a"/>
-          <w:sz w:val="24"/>
-          <w:szCs w:val="24"/>
-        </w:rPr>
-      </w:pPr>
-      <w:r>
-        <w:rPr>
-          <w:rtl w:val="0"/>
-        </w:rPr>
-      </w:r>
-    </w:p>
-    <w:p>
-      <w:pPr>
-        <w:spacing w:after="0" w:lineRule="auto"/>
-        <w:ind w:left="566.9291338582675" w:firstLine="0"/>
-        <w:rPr>
-          <w:rFonts w:ascii="Proxima Nova" w:cs="Proxima Nova" w:eastAsia="Proxima Nova" w:hAnsi="Proxima Nova"/>
-          <w:b w:val="1"/>
-          <w:bCs w:val="1"/>
-          <w:color w:val="5a6a7a"/>
-          <w:sz w:val="24"/>
-          <w:szCs w:val="24"/>
-        </w:rPr>
-      </w:pPr>
-      <w:r>
-        <w:rPr>
-          <w:rtl w:val="0"/>
-        </w:rPr>
-      </w:r>
-    </w:p>
-    <w:p>
-      <w:pPr>
-        <w:spacing w:after="0" w:lineRule="auto"/>
-        <w:ind w:left="566.9291338582675" w:firstLine="0"/>
-        <w:rPr>
-          <w:rFonts w:ascii="Proxima Nova" w:cs="Proxima Nova" w:eastAsia="Proxima Nova" w:hAnsi="Proxima Nova"/>
-          <w:b w:val="1"/>
-          <w:bCs w:val="1"/>
-          <w:color w:val="5a6a7a"/>
-          <w:sz w:val="24"/>
-          <w:szCs w:val="24"/>
-        </w:rPr>
-      </w:pPr>
-      <w:r>
-        <w:rPr>
-          <w:rtl w:val="0"/>
-        </w:rPr>
-      </w:r>
-    </w:p>
-    <w:p>
-      <w:pPr>
-        <w:spacing w:after="0" w:lineRule="auto"/>
-        <w:ind w:left="566.9291338582675" w:firstLine="0"/>
-        <w:rPr>
-          <w:rFonts w:ascii="Proxima Nova" w:cs="Proxima Nova" w:eastAsia="Proxima Nova" w:hAnsi="Proxima Nova"/>
-          <w:b w:val="1"/>
-          <w:bCs w:val="1"/>
-          <w:color w:val="5a6a7a"/>
-          <w:sz w:val="24"/>
-          <w:szCs w:val="24"/>
-        </w:rPr>
-      </w:pPr>
-      <w:r>
-        <w:rPr>
-          <w:rtl w:val="0"/>
-        </w:rPr>
-      </w:r>
-    </w:p>
-    <w:p>
-      <w:pPr>
-        <w:spacing w:after="0" w:lineRule="auto"/>
-        <w:ind w:left="566.9291338582675" w:firstLine="0"/>
-        <w:rPr>
-          <w:rFonts w:ascii="Proxima Nova" w:cs="Proxima Nova" w:eastAsia="Proxima Nova" w:hAnsi="Proxima Nova"/>
-          <w:b w:val="1"/>
-          <w:bCs w:val="1"/>
-          <w:color w:val="5a6a7a"/>
-          <w:sz w:val="24"/>
-          <w:szCs w:val="24"/>
         </w:rPr>
       </w:pPr>
       <w:r>
@@ -498,8 +382,6 @@
           <w:b w:val="1"/>
           <w:bCs w:val="1"/>
           <w:color w:val="5a6a7a"/>
-          <w:sz w:val="24"/>
-          <w:szCs w:val="24"/>
         </w:rPr>
       </w:pPr>
       <w:r>
@@ -511,14 +393,114 @@
     <w:p>
       <w:pPr>
         <w:spacing w:after="0" w:lineRule="auto"/>
-        <w:ind w:left="566.9291338582675" w:firstLine="0"/>
+        <w:ind w:left="0" w:firstLine="0"/>
         <w:rPr>
           <w:rFonts w:ascii="Proxima Nova" w:cs="Proxima Nova" w:eastAsia="Proxima Nova" w:hAnsi="Proxima Nova"/>
           <w:b w:val="1"/>
           <w:bCs w:val="1"/>
           <w:color w:val="5a6a7a"/>
-          <w:sz w:val="24"/>
-          <w:szCs w:val="24"/>
+        </w:rPr>
+      </w:pPr>
+      <w:r>
+        <w:rPr>
+          <w:rtl w:val="0"/>
+        </w:rPr>
+      </w:r>
+    </w:p>
+    <w:p>
+      <w:pPr>
+        <w:spacing w:after="0" w:lineRule="auto"/>
+        <w:ind w:left="0" w:firstLine="0"/>
+        <w:rPr>
+          <w:rFonts w:ascii="Proxima Nova" w:cs="Proxima Nova" w:eastAsia="Proxima Nova" w:hAnsi="Proxima Nova"/>
+          <w:b w:val="1"/>
+          <w:bCs w:val="1"/>
+          <w:color w:val="5a6a7a"/>
+        </w:rPr>
+      </w:pPr>
+      <w:r>
+        <w:rPr>
+          <w:rtl w:val="0"/>
+        </w:rPr>
+      </w:r>
+    </w:p>
+    <w:p>
+      <w:pPr>
+        <w:spacing w:after="0" w:lineRule="auto"/>
+        <w:ind w:left="0" w:firstLine="0"/>
+        <w:rPr>
+          <w:rFonts w:ascii="Proxima Nova" w:cs="Proxima Nova" w:eastAsia="Proxima Nova" w:hAnsi="Proxima Nova"/>
+          <w:b w:val="1"/>
+          <w:bCs w:val="1"/>
+          <w:color w:val="5a6a7a"/>
+        </w:rPr>
+      </w:pPr>
+      <w:r>
+        <w:rPr>
+          <w:rtl w:val="0"/>
+        </w:rPr>
+      </w:r>
+    </w:p>
+    <w:p>
+      <w:pPr>
+        <w:spacing w:after="0" w:lineRule="auto"/>
+        <w:ind w:left="0" w:firstLine="0"/>
+        <w:rPr>
+          <w:rFonts w:ascii="Proxima Nova" w:cs="Proxima Nova" w:eastAsia="Proxima Nova" w:hAnsi="Proxima Nova"/>
+          <w:b w:val="1"/>
+          <w:bCs w:val="1"/>
+          <w:color w:val="5a6a7a"/>
+        </w:rPr>
+      </w:pPr>
+      <w:r>
+        <w:rPr>
+          <w:rtl w:val="0"/>
+        </w:rPr>
+      </w:r>
+    </w:p>
+    <w:p>
+      <w:pPr>
+        <w:spacing w:after="0" w:lineRule="auto"/>
+        <w:ind w:left="0" w:firstLine="0"/>
+        <w:rPr>
+          <w:rFonts w:ascii="Proxima Nova" w:cs="Proxima Nova" w:eastAsia="Proxima Nova" w:hAnsi="Proxima Nova"/>
+          <w:b w:val="1"/>
+          <w:bCs w:val="1"/>
+          <w:color w:val="5a6a7a"/>
+        </w:rPr>
+      </w:pPr>
+      <w:r>
+        <w:rPr>
+          <w:rtl w:val="0"/>
+        </w:rPr>
+      </w:r>
+    </w:p>
+    <w:p>
+      <w:pPr>
+        <w:spacing w:after="0" w:lineRule="auto"/>
+        <w:ind w:left="0" w:firstLine="0"/>
+        <w:rPr>
+          <w:rFonts w:ascii="Proxima Nova" w:cs="Proxima Nova" w:eastAsia="Proxima Nova" w:hAnsi="Proxima Nova"/>
+          <w:b w:val="1"/>
+          <w:bCs w:val="1"/>
+          <w:color w:val="5a6a7a"/>
+        </w:rPr>
+      </w:pPr>
+      <w:r>
+        <w:rPr>
+          <w:rtl w:val="0"/>
+        </w:rPr>
+      </w:r>
+    </w:p>
+    <w:p>
+      <w:pPr>
+        <w:spacing w:after="0" w:lineRule="auto"/>
+        <w:ind w:left="0" w:firstLine="0"/>
+        <w:rPr>
+          <w:rFonts w:ascii="Proxima Nova" w:cs="Proxima Nova" w:eastAsia="Proxima Nova" w:hAnsi="Proxima Nova"/>
+          <w:b w:val="1"/>
+          <w:bCs w:val="1"/>
+          <w:color w:val="5a6a7a"/>
         </w:rPr>
       </w:pPr>
       <w:r>
@@ -591,8 +573,6 @@
           <w:b w:val="1"/>
           <w:bCs w:val="1"/>
           <w:color w:val="5a6a7a"/>
-          <w:sz w:val="28"/>
-          <w:szCs w:val="28"/>
         </w:rPr>
       </w:pPr>
       <w:r>
@@ -604,6 +584,69 @@
     <w:p>
       <w:pPr>
         <w:spacing w:after="240" w:lineRule="auto"/>
+        <w:ind w:left="0" w:firstLine="0"/>
+        <w:rPr>
+          <w:rFonts w:ascii="Proxima Nova" w:cs="Proxima Nova" w:eastAsia="Proxima Nova" w:hAnsi="Proxima Nova"/>
+          <w:b w:val="1"/>
+          <w:bCs w:val="1"/>
+          <w:color w:val="5a6a7a"/>
+        </w:rPr>
+      </w:pPr>
+      <w:r>
+        <w:rPr>
+          <w:rtl w:val="0"/>
+        </w:rPr>
+      </w:r>
+    </w:p>
+    <w:p>
+      <w:pPr>
+        <w:spacing w:after="240" w:lineRule="auto"/>
+        <w:ind w:left="0" w:firstLine="0"/>
+        <w:rPr>
+          <w:rFonts w:ascii="Proxima Nova" w:cs="Proxima Nova" w:eastAsia="Proxima Nova" w:hAnsi="Proxima Nova"/>
+          <w:b w:val="1"/>
+          <w:bCs w:val="1"/>
+          <w:color w:val="5a6a7a"/>
+        </w:rPr>
+      </w:pPr>
+      <w:r>
+        <w:rPr>
+          <w:rtl w:val="0"/>
+        </w:rPr>
+      </w:r>
+    </w:p>
+    <w:p>
+      <w:pPr>
+        <w:pStyle w:val="Heading3"/>
+        <w:spacing w:after="60" w:lineRule="auto"/>
+        <w:ind w:left="0" w:firstLine="0"/>
+        <w:rPr>
+          <w:rFonts w:ascii="Proxima Nova" w:cs="Proxima Nova" w:eastAsia="Proxima Nova" w:hAnsi="Proxima Nova"/>
+          <w:b w:val="1"/>
+          <w:bCs w:val="1"/>
+          <w:color w:val="f15a22"/>
+          <w:sz w:val="22"/>
+          <w:szCs w:val="22"/>
+        </w:rPr>
+      </w:pPr>
+      <w:bookmarkStart w:colFirst="0" w:colLast="0" w:name="_j6q8lwikgieh" w:id="3"/>
+      <w:bookmarkEnd w:id="3"/>
+      <w:r>
+        <w:rPr>
+          <w:rFonts w:ascii="Proxima Nova" w:cs="Proxima Nova" w:eastAsia="Proxima Nova" w:hAnsi="Proxima Nova"/>
+          <w:b w:val="1"/>
+          <w:bCs w:val="1"/>
+          <w:color w:val="f15a22"/>
+          <w:sz w:val="22"/>
+          <w:szCs w:val="22"/>
+          <w:rtl w:val="0"/>
+        </w:rPr>
+        <w:t xml:space="preserve">PREPARED BY</w:t>
+      </w:r>
+    </w:p>
+    <w:p>
+      <w:pPr>
+        <w:spacing w:after="60" w:lineRule="auto"/>
         <w:ind w:left="0" w:firstLine="0"/>
         <w:rPr>
           <w:rFonts w:ascii="Proxima Nova" w:cs="Proxima Nova" w:eastAsia="Proxima Nova" w:hAnsi="Proxima Nova"/>
@@ -616,62 +659,50 @@
       </w:pPr>
       <w:r>
         <w:rPr>
-          <w:rtl w:val="0"/>
-        </w:rPr>
-      </w:r>
-    </w:p>
-    <w:p>
-      <w:pPr>
-        <w:spacing w:after="240" w:lineRule="auto"/>
-        <w:ind w:left="0" w:firstLine="0"/>
-        <w:rPr>
           <w:rFonts w:ascii="Proxima Nova" w:cs="Proxima Nova" w:eastAsia="Proxima Nova" w:hAnsi="Proxima Nova"/>
           <w:b w:val="1"/>
           <w:bCs w:val="1"/>
           <w:color w:val="5a6a7a"/>
           <w:sz w:val="28"/>
           <w:szCs w:val="28"/>
-        </w:rPr>
-      </w:pPr>
-      <w:r>
-        <w:rPr>
-          <w:rtl w:val="0"/>
-        </w:rPr>
-      </w:r>
-    </w:p>
-    <w:p>
-      <w:pPr>
-        <w:pStyle w:val="Heading3"/>
-        <w:spacing w:after="60" w:lineRule="auto"/>
+          <w:rtl w:val="0"/>
+        </w:rPr>
+        <w:t xml:space="preserve">{</w:t>
+      </w:r>
+      <w:r>
+        <w:rPr>
+          <w:rFonts w:ascii="Proxima Nova" w:cs="Proxima Nova" w:eastAsia="Proxima Nova" w:hAnsi="Proxima Nova"/>
+          <w:b w:val="1"/>
+          <w:bCs w:val="1"/>
+          <w:color w:val="5a6a7a"/>
+          <w:sz w:val="24"/>
+          <w:szCs w:val="24"/>
+          <w:rtl w:val="0"/>
+        </w:rPr>
+        <w:t xml:space="preserve">prepared_by}</w:t>
+      </w:r>
+      <w:r>
+        <w:rPr>
+          <w:rtl w:val="0"/>
+        </w:rPr>
+      </w:r>
+    </w:p>
+    <w:p>
+      <w:pPr>
+        <w:spacing w:after="0" w:lineRule="auto"/>
         <w:ind w:left="0" w:firstLine="0"/>
-        <w:rPr>
-          <w:rFonts w:ascii="Proxima Nova" w:cs="Proxima Nova" w:eastAsia="Proxima Nova" w:hAnsi="Proxima Nova"/>
-          <w:b w:val="1"/>
-          <w:bCs w:val="1"/>
-          <w:color w:val="f15a22"/>
+        <w:rPr/>
+      </w:pPr>
+      <w:r>
+        <w:rPr>
+          <w:rFonts w:ascii="Proxima Nova" w:cs="Proxima Nova" w:eastAsia="Proxima Nova" w:hAnsi="Proxima Nova"/>
           <w:sz w:val="22"/>
           <w:szCs w:val="22"/>
-        </w:rPr>
-      </w:pPr>
-      <w:bookmarkStart w:colFirst="0" w:colLast="0" w:name="_j6q8lwikgieh" w:id="3"/>
-      <w:bookmarkEnd w:id="3"/>
-      <w:r>
-        <w:rPr>
-          <w:rFonts w:ascii="Proxima Nova" w:cs="Proxima Nova" w:eastAsia="Proxima Nova" w:hAnsi="Proxima Nova"/>
-          <w:b w:val="1"/>
-          <w:bCs w:val="1"/>
-          <w:color w:val="f15a22"/>
-          <w:sz w:val="22"/>
-          <w:szCs w:val="22"/>
-          <w:rtl w:val="0"/>
-        </w:rPr>
-        <w:t xml:space="preserve">PREPARED BY</w:t>
-      </w:r>
-    </w:p>
-    <w:p>
-      <w:pPr>
-        <w:spacing w:after="60" w:lineRule="auto"/>
-        <w:ind w:left="0" w:firstLine="0"/>
+          <w:rtl w:val="0"/>
+        </w:rPr>
+        <w:t xml:space="preserve">{company_name}</w:t>
+      </w:r>
+      <w:r>
         <w:rPr>
           <w:rFonts w:ascii="Proxima Nova" w:cs="Proxima Nova" w:eastAsia="Proxima Nova" w:hAnsi="Proxima Nova"/>
           <w:b w:val="1"/>
@@ -679,61 +710,6 @@
           <w:color w:val="5a6a7a"/>
           <w:sz w:val="28"/>
           <w:szCs w:val="28"/>
-        </w:rPr>
-      </w:pPr>
-      <w:r>
-        <w:rPr>
-          <w:rFonts w:ascii="Proxima Nova" w:cs="Proxima Nova" w:eastAsia="Proxima Nova" w:hAnsi="Proxima Nova"/>
-          <w:b w:val="1"/>
-          <w:bCs w:val="1"/>
-          <w:color w:val="5a6a7a"/>
-          <w:sz w:val="28"/>
-          <w:szCs w:val="28"/>
-          <w:rtl w:val="0"/>
-        </w:rPr>
-        <w:t xml:space="preserve">{</w:t>
-      </w:r>
-      <w:r>
-        <w:rPr>
-          <w:rFonts w:ascii="Proxima Nova" w:cs="Proxima Nova" w:eastAsia="Proxima Nova" w:hAnsi="Proxima Nova"/>
-          <w:b w:val="1"/>
-          <w:bCs w:val="1"/>
-          <w:color w:val="5a6a7a"/>
-          <w:sz w:val="24"/>
-          <w:szCs w:val="24"/>
-          <w:rtl w:val="0"/>
-        </w:rPr>
-        <w:t xml:space="preserve">prepared_by}</w:t>
-      </w:r>
-      <w:r>
-        <w:rPr>
-          <w:rtl w:val="0"/>
-        </w:rPr>
-      </w:r>
-    </w:p>
-    <w:p>
-      <w:pPr>
-        <w:spacing w:after="0" w:lineRule="auto"/>
-        <w:ind w:left="0" w:firstLine="0"/>
-        <w:rPr/>
-      </w:pPr>
-      <w:r>
-        <w:rPr>
-          <w:rFonts w:ascii="Proxima Nova" w:cs="Proxima Nova" w:eastAsia="Proxima Nova" w:hAnsi="Proxima Nova"/>
-          <w:sz w:val="22"/>
-          <w:szCs w:val="22"/>
-          <w:rtl w:val="0"/>
-        </w:rPr>
-        <w:t xml:space="preserve">{company_name}</w:t>
-      </w:r>
-      <w:r>
-        <w:rPr>
-          <w:rFonts w:ascii="Proxima Nova" w:cs="Proxima Nova" w:eastAsia="Proxima Nova" w:hAnsi="Proxima Nova"/>
-          <w:b w:val="1"/>
-          <w:bCs w:val="1"/>
-          <w:color w:val="5a6a7a"/>
-          <w:sz w:val="28"/>
-          <w:szCs w:val="28"/>
           <w:rtl w:val="0"/>
         </w:rPr>
         <w:br w:type="textWrapping"/>
@@ -758,6 +734,20 @@
     </w:p>
     <w:p>
       <w:pPr>
+        <w:spacing w:after="200" w:before="300" w:lineRule="auto"/>
+        <w:rPr/>
+      </w:pPr>
+      <w:r>
+        <w:br w:type="page"/>
+      </w:r>
+      <w:r>
+        <w:rPr>
+          <w:rtl w:val="0"/>
+        </w:rPr>
+      </w:r>
+    </w:p>
+    <w:p>
+      <w:pPr>
         <w:pStyle w:val="Heading2"/>
         <w:spacing w:after="200" w:before="300" w:lineRule="auto"/>
         <w:ind w:left="0" w:firstLine="0"/>
@@ -909,7 +899,10 @@
       <w:pPr>
         <w:spacing w:after="0" w:lineRule="auto"/>
         <w:ind w:firstLine="0"/>
-        <w:rPr/>
+        <w:rPr>
+          <w:rFonts w:ascii="Proxima Nova" w:cs="Proxima Nova" w:eastAsia="Proxima Nova" w:hAnsi="Proxima Nova"/>
+          <w:color w:val="1a2a3a"/>
+        </w:rPr>
       </w:pPr>
       <w:r>
         <w:rPr>
@@ -931,49 +924,7 @@
         <w:br w:type="textWrapping"/>
         <w:br w:type="textWrapping"/>
         <w:br w:type="textWrapping"/>
-        <w:br w:type="textWrapping"/>
-        <w:br w:type="textWrapping"/>
-        <w:br w:type="textWrapping"/>
-        <w:br w:type="textWrapping"/>
-        <w:br w:type="textWrapping"/>
-        <w:br w:type="textWrapping"/>
-        <w:br w:type="textWrapping"/>
-        <w:br w:type="textWrapping"/>
-        <w:br w:type="textWrapping"/>
-        <w:br w:type="textWrapping"/>
-        <w:br w:type="textWrapping"/>
-        <w:br w:type="textWrapping"/>
-        <w:br w:type="textWrapping"/>
-        <w:br w:type="textWrapping"/>
-        <w:br w:type="textWrapping"/>
-        <w:br w:type="textWrapping"/>
-        <w:br w:type="textWrapping"/>
-        <w:br w:type="textWrapping"/>
-        <w:br w:type="textWrapping"/>
-        <w:br w:type="textWrapping"/>
-        <w:br w:type="textWrapping"/>
-        <w:br w:type="textWrapping"/>
-        <w:br w:type="textWrapping"/>
-        <w:br w:type="textWrapping"/>
-        <w:br w:type="textWrapping"/>
-        <w:br w:type="textWrapping"/>
-        <w:br w:type="textWrapping"/>
-        <w:br w:type="textWrapping"/>
-        <w:br w:type="textWrapping"/>
-        <w:br w:type="textWrapping"/>
-        <w:br w:type="textWrapping"/>
-      </w:r>
-      <w:r>
-        <w:rPr>
-          <w:rtl w:val="0"/>
-        </w:rPr>
-      </w:r>
-    </w:p>
-    <w:p>
-      <w:pPr>
-        <w:spacing w:after="200" w:before="300" w:lineRule="auto"/>
-        <w:rPr/>
-      </w:pPr>
+      </w:r>
       <w:r>
         <w:rPr>
           <w:rtl w:val="0"/>
@@ -983,10 +934,9 @@
     <w:p>
       <w:pPr>
         <w:pStyle w:val="Heading2"/>
-        <w:spacing w:after="200" w:before="300" w:lineRule="auto"/>
-        <w:ind w:left="0" w:firstLine="0"/>
-        <w:rPr>
-          <w:rFonts w:ascii="Proxima Nova" w:cs="Proxima Nova" w:eastAsia="Proxima Nova" w:hAnsi="Proxima Nova"/>
+        <w:spacing w:after="200" w:lineRule="auto"/>
+        <w:rPr>
+          <w:rFonts w:ascii="Maven Pro" w:cs="Maven Pro" w:eastAsia="Maven Pro" w:hAnsi="Maven Pro"/>
           <w:b w:val="1"/>
           <w:bCs w:val="1"/>
           <w:color w:val="f15a22"/>
@@ -994,11 +944,11 @@
           <w:szCs w:val="32"/>
         </w:rPr>
       </w:pPr>
-      <w:bookmarkStart w:colFirst="0" w:colLast="0" w:name="_fxgepm3xl9eb" w:id="5"/>
+      <w:bookmarkStart w:colFirst="0" w:colLast="0" w:name="_65dt78ag3r7a" w:id="5"/>
       <w:bookmarkEnd w:id="5"/>
       <w:r>
         <w:rPr>
-          <w:rFonts w:ascii="Proxima Nova" w:cs="Proxima Nova" w:eastAsia="Proxima Nova" w:hAnsi="Proxima Nova"/>
+          <w:rFonts w:ascii="Maven Pro" w:cs="Maven Pro" w:eastAsia="Maven Pro" w:hAnsi="Maven Pro"/>
           <w:b w:val="1"/>
           <w:bCs w:val="1"/>
           <w:color w:val="f15a22"/>
@@ -1453,10 +1403,7 @@
       <w:pPr>
         <w:spacing w:after="140" w:lineRule="auto"/>
         <w:ind w:left="0" w:firstLine="0"/>
-        <w:rPr>
-          <w:sz w:val="24"/>
-          <w:szCs w:val="24"/>
-        </w:rPr>
+        <w:rPr/>
       </w:pPr>
       <w:r>
         <w:rPr>
@@ -1468,335 +1415,8 @@
         <w:t xml:space="preserve">{/show_executiveSummary}</w:t>
       </w:r>
       <w:r>
-        <w:rPr>
-          <w:rtl w:val="0"/>
-        </w:rPr>
-      </w:r>
-    </w:p>
-    <w:p>
-      <w:pPr>
-        <w:spacing w:after="140" w:lineRule="auto"/>
-        <w:ind w:left="0" w:firstLine="0"/>
-        <w:rPr>
-          <w:sz w:val="24"/>
-          <w:szCs w:val="24"/>
-        </w:rPr>
-      </w:pPr>
-      <w:r>
-        <w:rPr>
-          <w:rtl w:val="0"/>
-        </w:rPr>
-      </w:r>
-    </w:p>
-    <w:p>
-      <w:pPr>
-        <w:spacing w:after="140" w:lineRule="auto"/>
-        <w:ind w:left="0" w:firstLine="0"/>
-        <w:rPr>
-          <w:sz w:val="24"/>
-          <w:szCs w:val="24"/>
-        </w:rPr>
-      </w:pPr>
-      <w:r>
-        <w:rPr>
-          <w:rtl w:val="0"/>
-        </w:rPr>
-      </w:r>
-    </w:p>
-    <w:p>
-      <w:pPr>
-        <w:spacing w:after="140" w:lineRule="auto"/>
-        <w:ind w:left="0" w:firstLine="0"/>
-        <w:rPr>
-          <w:sz w:val="24"/>
-          <w:szCs w:val="24"/>
-        </w:rPr>
-      </w:pPr>
-      <w:r>
-        <w:rPr>
-          <w:rtl w:val="0"/>
-        </w:rPr>
-      </w:r>
-    </w:p>
-    <w:p>
-      <w:pPr>
-        <w:spacing w:after="140" w:lineRule="auto"/>
-        <w:ind w:left="0" w:firstLine="0"/>
-        <w:rPr>
-          <w:sz w:val="24"/>
-          <w:szCs w:val="24"/>
-        </w:rPr>
-      </w:pPr>
-      <w:r>
-        <w:rPr>
-          <w:rtl w:val="0"/>
-        </w:rPr>
-      </w:r>
-    </w:p>
-    <w:p>
-      <w:pPr>
-        <w:spacing w:after="140" w:lineRule="auto"/>
-        <w:ind w:left="0" w:firstLine="0"/>
-        <w:rPr>
-          <w:sz w:val="24"/>
-          <w:szCs w:val="24"/>
-        </w:rPr>
-      </w:pPr>
-      <w:r>
-        <w:rPr>
-          <w:rtl w:val="0"/>
-        </w:rPr>
-      </w:r>
-    </w:p>
-    <w:p>
-      <w:pPr>
-        <w:spacing w:after="140" w:lineRule="auto"/>
-        <w:ind w:left="0" w:firstLine="0"/>
-        <w:rPr>
-          <w:sz w:val="24"/>
-          <w:szCs w:val="24"/>
-        </w:rPr>
-      </w:pPr>
-      <w:r>
-        <w:rPr>
-          <w:rtl w:val="0"/>
-        </w:rPr>
-      </w:r>
-    </w:p>
-    <w:p>
-      <w:pPr>
-        <w:spacing w:after="140" w:lineRule="auto"/>
-        <w:ind w:left="0" w:firstLine="0"/>
-        <w:rPr>
-          <w:sz w:val="24"/>
-          <w:szCs w:val="24"/>
-        </w:rPr>
-      </w:pPr>
-      <w:r>
-        <w:rPr>
-          <w:rtl w:val="0"/>
-        </w:rPr>
-      </w:r>
-    </w:p>
-    <w:p>
-      <w:pPr>
-        <w:spacing w:after="140" w:lineRule="auto"/>
-        <w:ind w:left="0" w:firstLine="0"/>
-        <w:rPr>
-          <w:sz w:val="24"/>
-          <w:szCs w:val="24"/>
-        </w:rPr>
-      </w:pPr>
-      <w:r>
-        <w:rPr>
-          <w:rtl w:val="0"/>
-        </w:rPr>
-      </w:r>
-    </w:p>
-    <w:p>
-      <w:pPr>
-        <w:spacing w:after="140" w:lineRule="auto"/>
-        <w:ind w:left="0" w:firstLine="0"/>
-        <w:rPr>
-          <w:sz w:val="24"/>
-          <w:szCs w:val="24"/>
-        </w:rPr>
-      </w:pPr>
-      <w:r>
-        <w:rPr>
-          <w:rtl w:val="0"/>
-        </w:rPr>
-      </w:r>
-    </w:p>
-    <w:p>
-      <w:pPr>
-        <w:spacing w:after="140" w:lineRule="auto"/>
-        <w:ind w:left="0" w:firstLine="0"/>
-        <w:rPr>
-          <w:sz w:val="24"/>
-          <w:szCs w:val="24"/>
-        </w:rPr>
-      </w:pPr>
-      <w:r>
-        <w:rPr>
-          <w:rtl w:val="0"/>
-        </w:rPr>
-      </w:r>
-    </w:p>
-    <w:p>
-      <w:pPr>
-        <w:spacing w:after="140" w:lineRule="auto"/>
-        <w:ind w:left="0" w:firstLine="0"/>
-        <w:rPr>
-          <w:sz w:val="24"/>
-          <w:szCs w:val="24"/>
-        </w:rPr>
-      </w:pPr>
-      <w:r>
-        <w:rPr>
-          <w:rtl w:val="0"/>
-        </w:rPr>
-      </w:r>
-    </w:p>
-    <w:p>
-      <w:pPr>
-        <w:spacing w:after="140" w:lineRule="auto"/>
-        <w:ind w:left="0" w:firstLine="0"/>
-        <w:rPr>
-          <w:sz w:val="24"/>
-          <w:szCs w:val="24"/>
-        </w:rPr>
-      </w:pPr>
-      <w:r>
-        <w:rPr>
-          <w:rtl w:val="0"/>
-        </w:rPr>
-      </w:r>
-    </w:p>
-    <w:p>
-      <w:pPr>
-        <w:spacing w:after="140" w:lineRule="auto"/>
-        <w:ind w:left="0" w:firstLine="0"/>
-        <w:rPr>
-          <w:sz w:val="24"/>
-          <w:szCs w:val="24"/>
-        </w:rPr>
-      </w:pPr>
-      <w:r>
-        <w:rPr>
-          <w:rtl w:val="0"/>
-        </w:rPr>
-      </w:r>
-    </w:p>
-    <w:p>
-      <w:pPr>
-        <w:spacing w:after="140" w:lineRule="auto"/>
-        <w:ind w:left="0" w:firstLine="0"/>
-        <w:rPr>
-          <w:sz w:val="24"/>
-          <w:szCs w:val="24"/>
-        </w:rPr>
-      </w:pPr>
-      <w:r>
-        <w:rPr>
-          <w:rtl w:val="0"/>
-        </w:rPr>
-      </w:r>
-    </w:p>
-    <w:p>
-      <w:pPr>
-        <w:spacing w:after="140" w:lineRule="auto"/>
-        <w:ind w:left="0" w:firstLine="0"/>
-        <w:rPr>
-          <w:sz w:val="24"/>
-          <w:szCs w:val="24"/>
-        </w:rPr>
-      </w:pPr>
-      <w:r>
-        <w:rPr>
-          <w:rtl w:val="0"/>
-        </w:rPr>
-      </w:r>
-    </w:p>
-    <w:p>
-      <w:pPr>
-        <w:spacing w:after="140" w:lineRule="auto"/>
-        <w:ind w:left="0" w:firstLine="0"/>
-        <w:rPr>
-          <w:sz w:val="24"/>
-          <w:szCs w:val="24"/>
-        </w:rPr>
-      </w:pPr>
-      <w:r>
-        <w:rPr>
-          <w:rtl w:val="0"/>
-        </w:rPr>
-      </w:r>
-    </w:p>
-    <w:p>
-      <w:pPr>
-        <w:spacing w:after="140" w:lineRule="auto"/>
-        <w:ind w:left="0" w:firstLine="0"/>
-        <w:rPr>
-          <w:sz w:val="24"/>
-          <w:szCs w:val="24"/>
-        </w:rPr>
-      </w:pPr>
-      <w:r>
-        <w:rPr>
-          <w:rtl w:val="0"/>
-        </w:rPr>
-      </w:r>
-    </w:p>
-    <w:p>
-      <w:pPr>
-        <w:spacing w:after="140" w:lineRule="auto"/>
-        <w:ind w:left="0" w:firstLine="0"/>
-        <w:rPr>
-          <w:sz w:val="24"/>
-          <w:szCs w:val="24"/>
-        </w:rPr>
-      </w:pPr>
-      <w:r>
-        <w:rPr>
-          <w:rtl w:val="0"/>
-        </w:rPr>
-      </w:r>
-    </w:p>
-    <w:p>
-      <w:pPr>
-        <w:spacing w:after="140" w:lineRule="auto"/>
-        <w:ind w:left="0" w:firstLine="0"/>
-        <w:rPr>
-          <w:sz w:val="24"/>
-          <w:szCs w:val="24"/>
-        </w:rPr>
-      </w:pPr>
-      <w:r>
-        <w:rPr>
-          <w:rtl w:val="0"/>
-        </w:rPr>
-      </w:r>
-    </w:p>
-    <w:p>
-      <w:pPr>
-        <w:spacing w:after="140" w:lineRule="auto"/>
-        <w:ind w:left="0" w:firstLine="0"/>
-        <w:rPr>
-          <w:sz w:val="24"/>
-          <w:szCs w:val="24"/>
-        </w:rPr>
-      </w:pPr>
-      <w:r>
-        <w:rPr>
-          <w:rtl w:val="0"/>
-        </w:rPr>
-      </w:r>
-    </w:p>
-    <w:p>
-      <w:pPr>
-        <w:spacing w:after="140" w:lineRule="auto"/>
-        <w:ind w:left="0" w:firstLine="0"/>
-        <w:rPr>
-          <w:sz w:val="24"/>
-          <w:szCs w:val="24"/>
-        </w:rPr>
-      </w:pPr>
-      <w:r>
-        <w:rPr>
-          <w:rtl w:val="0"/>
-        </w:rPr>
-      </w:r>
-    </w:p>
-    <w:p>
-      <w:pPr>
-        <w:spacing w:after="140" w:lineRule="auto"/>
-        <w:ind w:left="0" w:firstLine="0"/>
-        <w:rPr>
-          <w:sz w:val="24"/>
-          <w:szCs w:val="24"/>
-        </w:rPr>
-      </w:pPr>
+        <w:br w:type="page"/>
+      </w:r>
       <w:r>
         <w:rPr>
           <w:rtl w:val="0"/>
@@ -1977,10 +1597,7 @@
       <w:pPr>
         <w:spacing w:after="140" w:lineRule="auto"/>
         <w:ind w:left="283.46456692913375" w:firstLine="0"/>
-        <w:rPr>
-          <w:sz w:val="24"/>
-          <w:szCs w:val="24"/>
-        </w:rPr>
+        <w:rPr/>
       </w:pPr>
       <w:r>
         <w:rPr>
@@ -1992,345 +1609,8 @@
         <w:t xml:space="preserve">{/show_proposedSolution}</w:t>
       </w:r>
       <w:r>
-        <w:rPr>
-          <w:rtl w:val="0"/>
-        </w:rPr>
-      </w:r>
-    </w:p>
-    <w:p>
-      <w:pPr>
-        <w:spacing w:after="140" w:lineRule="auto"/>
-        <w:ind w:left="283.46456692913375" w:firstLine="0"/>
-        <w:rPr>
-          <w:sz w:val="24"/>
-          <w:szCs w:val="24"/>
-        </w:rPr>
-      </w:pPr>
-      <w:r>
-        <w:rPr>
-          <w:rtl w:val="0"/>
-        </w:rPr>
-      </w:r>
-    </w:p>
-    <w:p>
-      <w:pPr>
-        <w:spacing w:after="140" w:lineRule="auto"/>
-        <w:ind w:left="283.46456692913375" w:firstLine="0"/>
-        <w:rPr>
-          <w:sz w:val="24"/>
-          <w:szCs w:val="24"/>
-        </w:rPr>
-      </w:pPr>
-      <w:r>
-        <w:rPr>
-          <w:rtl w:val="0"/>
-        </w:rPr>
-      </w:r>
-    </w:p>
-    <w:p>
-      <w:pPr>
-        <w:spacing w:after="140" w:lineRule="auto"/>
-        <w:ind w:left="283.46456692913375" w:firstLine="0"/>
-        <w:rPr>
-          <w:sz w:val="24"/>
-          <w:szCs w:val="24"/>
-        </w:rPr>
-      </w:pPr>
-      <w:r>
-        <w:rPr>
-          <w:rtl w:val="0"/>
-        </w:rPr>
-      </w:r>
-    </w:p>
-    <w:p>
-      <w:pPr>
-        <w:spacing w:after="140" w:lineRule="auto"/>
-        <w:ind w:left="283.46456692913375" w:firstLine="0"/>
-        <w:rPr>
-          <w:sz w:val="24"/>
-          <w:szCs w:val="24"/>
-        </w:rPr>
-      </w:pPr>
-      <w:r>
-        <w:rPr>
-          <w:rtl w:val="0"/>
-        </w:rPr>
-      </w:r>
-    </w:p>
-    <w:p>
-      <w:pPr>
-        <w:spacing w:after="140" w:lineRule="auto"/>
-        <w:ind w:left="283.46456692913375" w:firstLine="0"/>
-        <w:rPr>
-          <w:sz w:val="24"/>
-          <w:szCs w:val="24"/>
-        </w:rPr>
-      </w:pPr>
-      <w:r>
-        <w:rPr>
-          <w:rtl w:val="0"/>
-        </w:rPr>
-      </w:r>
-    </w:p>
-    <w:p>
-      <w:pPr>
-        <w:spacing w:after="140" w:lineRule="auto"/>
-        <w:ind w:left="283.46456692913375" w:firstLine="0"/>
-        <w:rPr>
-          <w:sz w:val="24"/>
-          <w:szCs w:val="24"/>
-        </w:rPr>
-      </w:pPr>
-      <w:r>
-        <w:rPr>
-          <w:rtl w:val="0"/>
-        </w:rPr>
-      </w:r>
-    </w:p>
-    <w:p>
-      <w:pPr>
-        <w:spacing w:after="140" w:lineRule="auto"/>
-        <w:ind w:left="283.46456692913375" w:firstLine="0"/>
-        <w:rPr>
-          <w:sz w:val="24"/>
-          <w:szCs w:val="24"/>
-        </w:rPr>
-      </w:pPr>
-      <w:r>
-        <w:rPr>
-          <w:rtl w:val="0"/>
-        </w:rPr>
-      </w:r>
-    </w:p>
-    <w:p>
-      <w:pPr>
-        <w:spacing w:after="140" w:lineRule="auto"/>
-        <w:ind w:left="283.46456692913375" w:firstLine="0"/>
-        <w:rPr>
-          <w:sz w:val="24"/>
-          <w:szCs w:val="24"/>
-        </w:rPr>
-      </w:pPr>
-      <w:r>
-        <w:rPr>
-          <w:rtl w:val="0"/>
-        </w:rPr>
-      </w:r>
-    </w:p>
-    <w:p>
-      <w:pPr>
-        <w:spacing w:after="140" w:lineRule="auto"/>
-        <w:ind w:left="283.46456692913375" w:firstLine="0"/>
-        <w:rPr>
-          <w:sz w:val="24"/>
-          <w:szCs w:val="24"/>
-        </w:rPr>
-      </w:pPr>
-      <w:r>
-        <w:rPr>
-          <w:rtl w:val="0"/>
-        </w:rPr>
-      </w:r>
-    </w:p>
-    <w:p>
-      <w:pPr>
-        <w:spacing w:after="140" w:lineRule="auto"/>
-        <w:ind w:left="283.46456692913375" w:firstLine="0"/>
-        <w:rPr>
-          <w:sz w:val="24"/>
-          <w:szCs w:val="24"/>
-        </w:rPr>
-      </w:pPr>
-      <w:r>
-        <w:rPr>
-          <w:rtl w:val="0"/>
-        </w:rPr>
-      </w:r>
-    </w:p>
-    <w:p>
-      <w:pPr>
-        <w:spacing w:after="140" w:lineRule="auto"/>
-        <w:ind w:left="283.46456692913375" w:firstLine="0"/>
-        <w:rPr>
-          <w:sz w:val="24"/>
-          <w:szCs w:val="24"/>
-        </w:rPr>
-      </w:pPr>
-      <w:r>
-        <w:rPr>
-          <w:rtl w:val="0"/>
-        </w:rPr>
-      </w:r>
-    </w:p>
-    <w:p>
-      <w:pPr>
-        <w:spacing w:after="140" w:lineRule="auto"/>
-        <w:ind w:left="283.46456692913375" w:firstLine="0"/>
-        <w:rPr>
-          <w:sz w:val="24"/>
-          <w:szCs w:val="24"/>
-        </w:rPr>
-      </w:pPr>
-      <w:r>
-        <w:rPr>
-          <w:rtl w:val="0"/>
-        </w:rPr>
-      </w:r>
-    </w:p>
-    <w:p>
-      <w:pPr>
-        <w:spacing w:after="140" w:lineRule="auto"/>
-        <w:ind w:left="283.46456692913375" w:firstLine="0"/>
-        <w:rPr>
-          <w:sz w:val="24"/>
-          <w:szCs w:val="24"/>
-        </w:rPr>
-      </w:pPr>
-      <w:r>
-        <w:rPr>
-          <w:rtl w:val="0"/>
-        </w:rPr>
-      </w:r>
-    </w:p>
-    <w:p>
-      <w:pPr>
-        <w:spacing w:after="140" w:lineRule="auto"/>
-        <w:ind w:left="283.46456692913375" w:firstLine="0"/>
-        <w:rPr>
-          <w:sz w:val="24"/>
-          <w:szCs w:val="24"/>
-        </w:rPr>
-      </w:pPr>
-      <w:r>
-        <w:rPr>
-          <w:rtl w:val="0"/>
-        </w:rPr>
-      </w:r>
-    </w:p>
-    <w:p>
-      <w:pPr>
-        <w:spacing w:after="140" w:lineRule="auto"/>
-        <w:ind w:left="283.46456692913375" w:firstLine="0"/>
-        <w:rPr>
-          <w:sz w:val="24"/>
-          <w:szCs w:val="24"/>
-        </w:rPr>
-      </w:pPr>
-      <w:r>
-        <w:rPr>
-          <w:rtl w:val="0"/>
-        </w:rPr>
-      </w:r>
-    </w:p>
-    <w:p>
-      <w:pPr>
-        <w:spacing w:after="140" w:lineRule="auto"/>
-        <w:ind w:left="283.46456692913375" w:firstLine="0"/>
-        <w:rPr>
-          <w:sz w:val="24"/>
-          <w:szCs w:val="24"/>
-        </w:rPr>
-      </w:pPr>
-      <w:r>
-        <w:rPr>
-          <w:rtl w:val="0"/>
-        </w:rPr>
-      </w:r>
-    </w:p>
-    <w:p>
-      <w:pPr>
-        <w:spacing w:after="140" w:lineRule="auto"/>
-        <w:ind w:left="283.46456692913375" w:firstLine="0"/>
-        <w:rPr>
-          <w:sz w:val="24"/>
-          <w:szCs w:val="24"/>
-        </w:rPr>
-      </w:pPr>
-      <w:r>
-        <w:rPr>
-          <w:rtl w:val="0"/>
-        </w:rPr>
-      </w:r>
-    </w:p>
-    <w:p>
-      <w:pPr>
-        <w:spacing w:after="140" w:lineRule="auto"/>
-        <w:ind w:left="283.46456692913375" w:firstLine="0"/>
-        <w:rPr>
-          <w:sz w:val="24"/>
-          <w:szCs w:val="24"/>
-        </w:rPr>
-      </w:pPr>
-      <w:r>
-        <w:rPr>
-          <w:rtl w:val="0"/>
-        </w:rPr>
-      </w:r>
-    </w:p>
-    <w:p>
-      <w:pPr>
-        <w:spacing w:after="140" w:lineRule="auto"/>
-        <w:ind w:left="283.46456692913375" w:firstLine="0"/>
-        <w:rPr>
-          <w:sz w:val="24"/>
-          <w:szCs w:val="24"/>
-        </w:rPr>
-      </w:pPr>
-      <w:r>
-        <w:rPr>
-          <w:rtl w:val="0"/>
-        </w:rPr>
-      </w:r>
-    </w:p>
-    <w:p>
-      <w:pPr>
-        <w:spacing w:after="200" w:before="300" w:lineRule="auto"/>
-        <w:rPr/>
-      </w:pPr>
-      <w:r>
-        <w:rPr>
-          <w:rtl w:val="0"/>
-        </w:rPr>
-      </w:r>
-    </w:p>
-    <w:p>
-      <w:pPr>
-        <w:spacing w:after="200" w:before="300" w:lineRule="auto"/>
-        <w:rPr/>
-      </w:pPr>
-      <w:r>
-        <w:rPr>
-          <w:rtl w:val="0"/>
-        </w:rPr>
-      </w:r>
-    </w:p>
-    <w:p>
-      <w:pPr>
-        <w:spacing w:after="200" w:before="300" w:lineRule="auto"/>
-        <w:rPr/>
-      </w:pPr>
-      <w:r>
-        <w:rPr>
-          <w:rtl w:val="0"/>
-        </w:rPr>
-      </w:r>
-    </w:p>
-    <w:p>
-      <w:pPr>
-        <w:spacing w:after="200" w:before="300" w:lineRule="auto"/>
-        <w:rPr/>
-      </w:pPr>
-      <w:r>
-        <w:rPr>
-          <w:rtl w:val="0"/>
-        </w:rPr>
-      </w:r>
-    </w:p>
-    <w:p>
-      <w:pPr>
-        <w:spacing w:after="200" w:before="300" w:lineRule="auto"/>
-        <w:rPr/>
-      </w:pPr>
+        <w:br w:type="page"/>
+      </w:r>
       <w:r>
         <w:rPr>
           <w:rtl w:val="0"/>
@@ -2710,8 +1990,6 @@
         <w:ind w:left="425.19685039370086" w:firstLine="0"/>
         <w:rPr>
           <w:rFonts w:ascii="Proxima Nova" w:cs="Proxima Nova" w:eastAsia="Proxima Nova" w:hAnsi="Proxima Nova"/>
-          <w:sz w:val="24"/>
-          <w:szCs w:val="24"/>
         </w:rPr>
       </w:pPr>
       <w:r>
@@ -2722,6 +2000,11 @@
           <w:rtl w:val="0"/>
         </w:rPr>
         <w:t xml:space="preserve">{/scope_objective}</w:t>
+      </w:r>
+      <w:r>
+        <w:rPr>
+          <w:rtl w:val="0"/>
+        </w:rPr>
       </w:r>
     </w:p>
     <w:p>
@@ -2730,26 +2013,32 @@
         <w:ind w:left="425.19685039370086" w:firstLine="0"/>
         <w:rPr>
           <w:rFonts w:ascii="Proxima Nova" w:cs="Proxima Nova" w:eastAsia="Proxima Nova" w:hAnsi="Proxima Nova"/>
-          <w:sz w:val="24"/>
-          <w:szCs w:val="24"/>
-        </w:rPr>
-      </w:pPr>
-      <w:r>
-        <w:rPr>
-          <w:rtl w:val="0"/>
-        </w:rPr>
-      </w:r>
-    </w:p>
-    <w:p>
-      <w:pPr>
-        <w:spacing w:after="60" w:lineRule="auto"/>
+        </w:rPr>
+      </w:pPr>
+      <w:r>
+        <w:rPr>
+          <w:rtl w:val="0"/>
+        </w:rPr>
+      </w:r>
+    </w:p>
+    <w:p>
+      <w:pPr>
+        <w:spacing w:after="140" w:lineRule="auto"/>
         <w:ind w:left="425.19685039370086" w:firstLine="0"/>
         <w:rPr>
-          <w:rFonts w:ascii="Proxima Nova" w:cs="Proxima Nova" w:eastAsia="Proxima Nova" w:hAnsi="Proxima Nova"/>
-          <w:sz w:val="24"/>
-          <w:szCs w:val="24"/>
-        </w:rPr>
-      </w:pPr>
+          <w:sz w:val="24"/>
+          <w:szCs w:val="24"/>
+        </w:rPr>
+      </w:pPr>
+      <w:r>
+        <w:rPr>
+          <w:rFonts w:ascii="Proxima Nova" w:cs="Proxima Nova" w:eastAsia="Proxima Nova" w:hAnsi="Proxima Nova"/>
+          <w:sz w:val="24"/>
+          <w:szCs w:val="24"/>
+          <w:rtl w:val="0"/>
+        </w:rPr>
+        <w:t xml:space="preserve">{/scope_items}</w:t>
+      </w:r>
       <w:r>
         <w:rPr>
           <w:rtl w:val="0"/>
@@ -2760,34 +2049,7 @@
       <w:pPr>
         <w:spacing w:after="140" w:lineRule="auto"/>
         <w:ind w:left="425.19685039370086" w:firstLine="0"/>
-        <w:rPr>
-          <w:sz w:val="24"/>
-          <w:szCs w:val="24"/>
-        </w:rPr>
-      </w:pPr>
-      <w:r>
-        <w:rPr>
-          <w:rFonts w:ascii="Proxima Nova" w:cs="Proxima Nova" w:eastAsia="Proxima Nova" w:hAnsi="Proxima Nova"/>
-          <w:sz w:val="24"/>
-          <w:szCs w:val="24"/>
-          <w:rtl w:val="0"/>
-        </w:rPr>
-        <w:t xml:space="preserve">{/scope_items}</w:t>
-      </w:r>
-      <w:r>
-        <w:rPr>
-          <w:rtl w:val="0"/>
-        </w:rPr>
-      </w:r>
-    </w:p>
-    <w:p>
-      <w:pPr>
-        <w:spacing w:after="140" w:lineRule="auto"/>
-        <w:ind w:left="425.19685039370086" w:firstLine="0"/>
-        <w:rPr>
-          <w:sz w:val="24"/>
-          <w:szCs w:val="24"/>
-        </w:rPr>
+        <w:rPr/>
       </w:pPr>
       <w:r>
         <w:rPr>
@@ -2799,151 +2061,8 @@
         <w:t xml:space="preserve">{/show_scopeOfWork}</w:t>
       </w:r>
       <w:r>
-        <w:rPr>
-          <w:rtl w:val="0"/>
-        </w:rPr>
-      </w:r>
-    </w:p>
-    <w:p>
-      <w:pPr>
-        <w:spacing w:after="140" w:lineRule="auto"/>
-        <w:ind w:left="425.19685039370086" w:firstLine="0"/>
-        <w:rPr>
-          <w:sz w:val="24"/>
-          <w:szCs w:val="24"/>
-        </w:rPr>
-      </w:pPr>
-      <w:r>
-        <w:rPr>
-          <w:rtl w:val="0"/>
-        </w:rPr>
-      </w:r>
-    </w:p>
-    <w:p>
-      <w:pPr>
-        <w:spacing w:after="140" w:lineRule="auto"/>
-        <w:ind w:left="425.19685039370086" w:firstLine="0"/>
-        <w:rPr>
-          <w:sz w:val="24"/>
-          <w:szCs w:val="24"/>
-        </w:rPr>
-      </w:pPr>
-      <w:r>
-        <w:rPr>
-          <w:rtl w:val="0"/>
-        </w:rPr>
-      </w:r>
-    </w:p>
-    <w:p>
-      <w:pPr>
-        <w:spacing w:after="140" w:lineRule="auto"/>
-        <w:ind w:left="425.19685039370086" w:firstLine="0"/>
-        <w:rPr>
-          <w:sz w:val="24"/>
-          <w:szCs w:val="24"/>
-        </w:rPr>
-      </w:pPr>
-      <w:r>
-        <w:rPr>
-          <w:rtl w:val="0"/>
-        </w:rPr>
-      </w:r>
-    </w:p>
-    <w:p>
-      <w:pPr>
-        <w:spacing w:after="140" w:lineRule="auto"/>
-        <w:ind w:left="425.19685039370086" w:firstLine="0"/>
-        <w:rPr>
-          <w:sz w:val="24"/>
-          <w:szCs w:val="24"/>
-        </w:rPr>
-      </w:pPr>
-      <w:r>
-        <w:rPr>
-          <w:rtl w:val="0"/>
-        </w:rPr>
-      </w:r>
-    </w:p>
-    <w:p>
-      <w:pPr>
-        <w:spacing w:after="140" w:lineRule="auto"/>
-        <w:ind w:left="425.19685039370086" w:firstLine="0"/>
-        <w:rPr>
-          <w:sz w:val="24"/>
-          <w:szCs w:val="24"/>
-        </w:rPr>
-      </w:pPr>
-      <w:r>
-        <w:rPr>
-          <w:rtl w:val="0"/>
-        </w:rPr>
-      </w:r>
-    </w:p>
-    <w:p>
-      <w:pPr>
-        <w:spacing w:after="140" w:lineRule="auto"/>
-        <w:ind w:left="425.19685039370086" w:firstLine="0"/>
-        <w:rPr>
-          <w:sz w:val="24"/>
-          <w:szCs w:val="24"/>
-        </w:rPr>
-      </w:pPr>
-      <w:r>
-        <w:rPr>
-          <w:rtl w:val="0"/>
-        </w:rPr>
-      </w:r>
-    </w:p>
-    <w:p>
-      <w:pPr>
-        <w:spacing w:after="140" w:lineRule="auto"/>
-        <w:ind w:left="425.19685039370086" w:firstLine="0"/>
-        <w:rPr>
-          <w:sz w:val="24"/>
-          <w:szCs w:val="24"/>
-        </w:rPr>
-      </w:pPr>
-      <w:r>
-        <w:rPr>
-          <w:rtl w:val="0"/>
-        </w:rPr>
-      </w:r>
-    </w:p>
-    <w:p>
-      <w:pPr>
-        <w:spacing w:after="140" w:lineRule="auto"/>
-        <w:ind w:left="425.19685039370086" w:firstLine="0"/>
-        <w:rPr>
-          <w:sz w:val="24"/>
-          <w:szCs w:val="24"/>
-        </w:rPr>
-      </w:pPr>
-      <w:r>
-        <w:rPr>
-          <w:rtl w:val="0"/>
-        </w:rPr>
-      </w:r>
-    </w:p>
-    <w:p>
-      <w:pPr>
-        <w:spacing w:after="140" w:lineRule="auto"/>
-        <w:ind w:left="425.19685039370086" w:firstLine="0"/>
-        <w:rPr>
-          <w:sz w:val="24"/>
-          <w:szCs w:val="24"/>
-        </w:rPr>
-      </w:pPr>
-      <w:r>
-        <w:rPr>
-          <w:rtl w:val="0"/>
-        </w:rPr>
-      </w:r>
-    </w:p>
-    <w:p>
-      <w:pPr>
-        <w:spacing w:after="200" w:before="300" w:lineRule="auto"/>
-        <w:rPr/>
-      </w:pPr>
+        <w:br w:type="page"/>
+      </w:r>
       <w:r>
         <w:rPr>
           <w:rtl w:val="0"/>
@@ -3037,8 +2156,6 @@
         <w:ind w:left="425.19685039370086" w:firstLine="0"/>
         <w:rPr>
           <w:rFonts w:ascii="Proxima Nova" w:cs="Proxima Nova" w:eastAsia="Proxima Nova" w:hAnsi="Proxima Nova"/>
-          <w:sz w:val="24"/>
-          <w:szCs w:val="24"/>
         </w:rPr>
       </w:pPr>
       <w:r>
@@ -3166,8 +2283,6 @@
         <w:ind w:left="425.19685039370086" w:firstLine="0"/>
         <w:rPr>
           <w:rFonts w:ascii="Proxima Nova" w:cs="Proxima Nova" w:eastAsia="Proxima Nova" w:hAnsi="Proxima Nova"/>
-          <w:sz w:val="24"/>
-          <w:szCs w:val="24"/>
         </w:rPr>
       </w:pPr>
       <w:r>
@@ -3200,11 +2315,7 @@
       <w:pPr>
         <w:spacing w:after="140" w:lineRule="auto"/>
         <w:ind w:left="425.19685039370086" w:firstLine="0"/>
-        <w:rPr>
-          <w:rFonts w:ascii="Proxima Nova" w:cs="Proxima Nova" w:eastAsia="Proxima Nova" w:hAnsi="Proxima Nova"/>
-          <w:sz w:val="24"/>
-          <w:szCs w:val="24"/>
-        </w:rPr>
+        <w:rPr/>
       </w:pPr>
       <w:r>
         <w:rPr>
@@ -3214,159 +2325,14 @@
           <w:rtl w:val="0"/>
         </w:rPr>
         <w:t xml:space="preserve">{/show_deliverables}</w:t>
-        <w:br w:type="textWrapping"/>
-        <w:br w:type="textWrapping"/>
-        <w:br w:type="textWrapping"/>
-        <w:br w:type="textWrapping"/>
-        <w:br w:type="textWrapping"/>
-        <w:br w:type="textWrapping"/>
-        <w:br w:type="textWrapping"/>
-        <w:br w:type="textWrapping"/>
-        <w:br w:type="textWrapping"/>
-        <w:br w:type="textWrapping"/>
-        <w:br w:type="textWrapping"/>
-        <w:br w:type="textWrapping"/>
-        <w:br w:type="textWrapping"/>
-      </w:r>
-    </w:p>
-    <w:p>
-      <w:pPr>
-        <w:spacing w:after="140" w:lineRule="auto"/>
-        <w:ind w:left="425.19685039370086" w:firstLine="0"/>
-        <w:rPr>
-          <w:rFonts w:ascii="Proxima Nova" w:cs="Proxima Nova" w:eastAsia="Proxima Nova" w:hAnsi="Proxima Nova"/>
-          <w:sz w:val="24"/>
-          <w:szCs w:val="24"/>
-        </w:rPr>
-      </w:pPr>
-      <w:r>
-        <w:rPr>
-          <w:rtl w:val="0"/>
-        </w:rPr>
-      </w:r>
-    </w:p>
-    <w:p>
-      <w:pPr>
-        <w:spacing w:after="140" w:lineRule="auto"/>
-        <w:ind w:left="425.19685039370086" w:firstLine="0"/>
-        <w:rPr>
-          <w:rFonts w:ascii="Proxima Nova" w:cs="Proxima Nova" w:eastAsia="Proxima Nova" w:hAnsi="Proxima Nova"/>
-          <w:sz w:val="24"/>
-          <w:szCs w:val="24"/>
-        </w:rPr>
-      </w:pPr>
-      <w:r>
-        <w:rPr>
-          <w:rtl w:val="0"/>
-        </w:rPr>
-      </w:r>
-    </w:p>
-    <w:p>
-      <w:pPr>
-        <w:spacing w:after="140" w:lineRule="auto"/>
-        <w:ind w:left="425.19685039370086" w:firstLine="0"/>
-        <w:rPr>
-          <w:rFonts w:ascii="Proxima Nova" w:cs="Proxima Nova" w:eastAsia="Proxima Nova" w:hAnsi="Proxima Nova"/>
-          <w:sz w:val="24"/>
-          <w:szCs w:val="24"/>
-        </w:rPr>
-      </w:pPr>
-      <w:r>
-        <w:rPr>
-          <w:rtl w:val="0"/>
-        </w:rPr>
-      </w:r>
-    </w:p>
-    <w:p>
-      <w:pPr>
-        <w:spacing w:after="140" w:lineRule="auto"/>
-        <w:ind w:left="425.19685039370086" w:firstLine="0"/>
-        <w:rPr>
-          <w:rFonts w:ascii="Proxima Nova" w:cs="Proxima Nova" w:eastAsia="Proxima Nova" w:hAnsi="Proxima Nova"/>
-          <w:sz w:val="24"/>
-          <w:szCs w:val="24"/>
-        </w:rPr>
-      </w:pPr>
-      <w:r>
-        <w:rPr>
-          <w:rtl w:val="0"/>
-        </w:rPr>
-      </w:r>
-    </w:p>
-    <w:p>
-      <w:pPr>
-        <w:spacing w:after="140" w:lineRule="auto"/>
-        <w:ind w:left="425.19685039370086" w:firstLine="0"/>
-        <w:rPr>
-          <w:rFonts w:ascii="Proxima Nova" w:cs="Proxima Nova" w:eastAsia="Proxima Nova" w:hAnsi="Proxima Nova"/>
-          <w:sz w:val="24"/>
-          <w:szCs w:val="24"/>
-        </w:rPr>
-      </w:pPr>
-      <w:r>
-        <w:rPr>
-          <w:rtl w:val="0"/>
-        </w:rPr>
-      </w:r>
-    </w:p>
-    <w:p>
-      <w:pPr>
-        <w:spacing w:after="140" w:lineRule="auto"/>
-        <w:ind w:left="425.19685039370086" w:firstLine="0"/>
-        <w:rPr>
-          <w:rFonts w:ascii="Proxima Nova" w:cs="Proxima Nova" w:eastAsia="Proxima Nova" w:hAnsi="Proxima Nova"/>
-          <w:sz w:val="24"/>
-          <w:szCs w:val="24"/>
-        </w:rPr>
-      </w:pPr>
-      <w:r>
-        <w:rPr>
-          <w:rtl w:val="0"/>
-        </w:rPr>
-      </w:r>
-    </w:p>
-    <w:p>
-      <w:pPr>
-        <w:spacing w:after="140" w:lineRule="auto"/>
-        <w:ind w:left="425.19685039370086" w:firstLine="0"/>
-        <w:rPr>
-          <w:rFonts w:ascii="Proxima Nova" w:cs="Proxima Nova" w:eastAsia="Proxima Nova" w:hAnsi="Proxima Nova"/>
-          <w:sz w:val="24"/>
-          <w:szCs w:val="24"/>
-        </w:rPr>
-      </w:pPr>
-      <w:r>
-        <w:rPr>
-          <w:rtl w:val="0"/>
-        </w:rPr>
-      </w:r>
-    </w:p>
-    <w:p>
-      <w:pPr>
-        <w:spacing w:after="140" w:lineRule="auto"/>
-        <w:ind w:left="0" w:firstLine="0"/>
-        <w:rPr>
-          <w:rFonts w:ascii="Proxima Nova" w:cs="Proxima Nova" w:eastAsia="Proxima Nova" w:hAnsi="Proxima Nova"/>
-          <w:sz w:val="24"/>
-          <w:szCs w:val="24"/>
-        </w:rPr>
-      </w:pPr>
-      <w:r>
-        <w:rPr>
-          <w:rtl w:val="0"/>
-        </w:rPr>
-      </w:r>
-    </w:p>
-    <w:p>
-      <w:pPr>
-        <w:spacing w:after="200" w:before="300" w:lineRule="auto"/>
-        <w:rPr/>
-      </w:pPr>
-      <w:r>
-        <w:rPr>
-          <w:rtl w:val="0"/>
-        </w:rPr>
-        <w:br w:type="textWrapping"/>
+      </w:r>
+      <w:r>
+        <w:br w:type="page"/>
+      </w:r>
+      <w:r>
+        <w:rPr>
+          <w:rtl w:val="0"/>
+        </w:rPr>
       </w:r>
     </w:p>
     <w:p>
@@ -3549,8 +2515,6 @@
         <w:ind w:left="420" w:firstLine="0"/>
         <w:rPr>
           <w:rFonts w:ascii="Proxima Nova" w:cs="Proxima Nova" w:eastAsia="Proxima Nova" w:hAnsi="Proxima Nova"/>
-          <w:sz w:val="24"/>
-          <w:szCs w:val="24"/>
         </w:rPr>
       </w:pPr>
       <w:r>
@@ -3583,11 +2547,7 @@
       <w:pPr>
         <w:spacing w:after="140" w:lineRule="auto"/>
         <w:ind w:left="420" w:firstLine="0"/>
-        <w:rPr>
-          <w:rFonts w:ascii="Proxima Nova" w:cs="Proxima Nova" w:eastAsia="Proxima Nova" w:hAnsi="Proxima Nova"/>
-          <w:sz w:val="24"/>
-          <w:szCs w:val="24"/>
-        </w:rPr>
+        <w:rPr/>
       </w:pPr>
       <w:r>
         <w:rPr>
@@ -3598,332 +2558,9 @@
         </w:rPr>
         <w:t xml:space="preserve">{/show_technicalArchitecture}</w:t>
       </w:r>
-    </w:p>
-    <w:p>
-      <w:pPr>
-        <w:spacing w:after="140" w:lineRule="auto"/>
-        <w:ind w:left="420" w:firstLine="0"/>
-        <w:rPr>
-          <w:rFonts w:ascii="Proxima Nova" w:cs="Proxima Nova" w:eastAsia="Proxima Nova" w:hAnsi="Proxima Nova"/>
-          <w:sz w:val="24"/>
-          <w:szCs w:val="24"/>
-        </w:rPr>
-      </w:pPr>
-      <w:r>
-        <w:rPr>
-          <w:rtl w:val="0"/>
-        </w:rPr>
-      </w:r>
-    </w:p>
-    <w:p>
-      <w:pPr>
-        <w:spacing w:after="140" w:lineRule="auto"/>
-        <w:ind w:left="420" w:firstLine="0"/>
-        <w:rPr>
-          <w:rFonts w:ascii="Proxima Nova" w:cs="Proxima Nova" w:eastAsia="Proxima Nova" w:hAnsi="Proxima Nova"/>
-          <w:sz w:val="24"/>
-          <w:szCs w:val="24"/>
-        </w:rPr>
-      </w:pPr>
-      <w:r>
-        <w:rPr>
-          <w:rtl w:val="0"/>
-        </w:rPr>
-      </w:r>
-    </w:p>
-    <w:p>
-      <w:pPr>
-        <w:spacing w:after="140" w:lineRule="auto"/>
-        <w:ind w:left="420" w:firstLine="0"/>
-        <w:rPr>
-          <w:rFonts w:ascii="Proxima Nova" w:cs="Proxima Nova" w:eastAsia="Proxima Nova" w:hAnsi="Proxima Nova"/>
-          <w:sz w:val="24"/>
-          <w:szCs w:val="24"/>
-        </w:rPr>
-      </w:pPr>
-      <w:r>
-        <w:rPr>
-          <w:rtl w:val="0"/>
-        </w:rPr>
-      </w:r>
-    </w:p>
-    <w:p>
-      <w:pPr>
-        <w:spacing w:after="140" w:lineRule="auto"/>
-        <w:ind w:left="420" w:firstLine="0"/>
-        <w:rPr>
-          <w:rFonts w:ascii="Proxima Nova" w:cs="Proxima Nova" w:eastAsia="Proxima Nova" w:hAnsi="Proxima Nova"/>
-          <w:sz w:val="24"/>
-          <w:szCs w:val="24"/>
-        </w:rPr>
-      </w:pPr>
-      <w:r>
-        <w:rPr>
-          <w:rtl w:val="0"/>
-        </w:rPr>
-      </w:r>
-    </w:p>
-    <w:p>
-      <w:pPr>
-        <w:spacing w:after="140" w:lineRule="auto"/>
-        <w:ind w:left="420" w:firstLine="0"/>
-        <w:rPr>
-          <w:rFonts w:ascii="Proxima Nova" w:cs="Proxima Nova" w:eastAsia="Proxima Nova" w:hAnsi="Proxima Nova"/>
-          <w:sz w:val="24"/>
-          <w:szCs w:val="24"/>
-        </w:rPr>
-      </w:pPr>
-      <w:r>
-        <w:rPr>
-          <w:rtl w:val="0"/>
-        </w:rPr>
-      </w:r>
-    </w:p>
-    <w:p>
-      <w:pPr>
-        <w:spacing w:after="140" w:lineRule="auto"/>
-        <w:ind w:left="420" w:firstLine="0"/>
-        <w:rPr>
-          <w:rFonts w:ascii="Proxima Nova" w:cs="Proxima Nova" w:eastAsia="Proxima Nova" w:hAnsi="Proxima Nova"/>
-          <w:sz w:val="24"/>
-          <w:szCs w:val="24"/>
-        </w:rPr>
-      </w:pPr>
-      <w:r>
-        <w:rPr>
-          <w:rtl w:val="0"/>
-        </w:rPr>
-      </w:r>
-    </w:p>
-    <w:p>
-      <w:pPr>
-        <w:spacing w:after="140" w:lineRule="auto"/>
-        <w:ind w:left="420" w:firstLine="0"/>
-        <w:rPr>
-          <w:rFonts w:ascii="Proxima Nova" w:cs="Proxima Nova" w:eastAsia="Proxima Nova" w:hAnsi="Proxima Nova"/>
-          <w:sz w:val="24"/>
-          <w:szCs w:val="24"/>
-        </w:rPr>
-      </w:pPr>
-      <w:r>
-        <w:rPr>
-          <w:rtl w:val="0"/>
-        </w:rPr>
-      </w:r>
-    </w:p>
-    <w:p>
-      <w:pPr>
-        <w:spacing w:after="140" w:lineRule="auto"/>
-        <w:ind w:left="420" w:firstLine="0"/>
-        <w:rPr>
-          <w:rFonts w:ascii="Proxima Nova" w:cs="Proxima Nova" w:eastAsia="Proxima Nova" w:hAnsi="Proxima Nova"/>
-          <w:sz w:val="24"/>
-          <w:szCs w:val="24"/>
-        </w:rPr>
-      </w:pPr>
-      <w:r>
-        <w:rPr>
-          <w:rtl w:val="0"/>
-        </w:rPr>
-      </w:r>
-    </w:p>
-    <w:p>
-      <w:pPr>
-        <w:spacing w:after="140" w:lineRule="auto"/>
-        <w:ind w:left="420" w:firstLine="0"/>
-        <w:rPr>
-          <w:rFonts w:ascii="Proxima Nova" w:cs="Proxima Nova" w:eastAsia="Proxima Nova" w:hAnsi="Proxima Nova"/>
-          <w:sz w:val="24"/>
-          <w:szCs w:val="24"/>
-        </w:rPr>
-      </w:pPr>
-      <w:r>
-        <w:rPr>
-          <w:rtl w:val="0"/>
-        </w:rPr>
-      </w:r>
-    </w:p>
-    <w:p>
-      <w:pPr>
-        <w:spacing w:after="140" w:lineRule="auto"/>
-        <w:ind w:left="420" w:firstLine="0"/>
-        <w:rPr>
-          <w:rFonts w:ascii="Proxima Nova" w:cs="Proxima Nova" w:eastAsia="Proxima Nova" w:hAnsi="Proxima Nova"/>
-          <w:sz w:val="24"/>
-          <w:szCs w:val="24"/>
-        </w:rPr>
-      </w:pPr>
-      <w:r>
-        <w:rPr>
-          <w:rtl w:val="0"/>
-        </w:rPr>
-      </w:r>
-    </w:p>
-    <w:p>
-      <w:pPr>
-        <w:spacing w:after="140" w:lineRule="auto"/>
-        <w:ind w:left="420" w:firstLine="0"/>
-        <w:rPr>
-          <w:rFonts w:ascii="Proxima Nova" w:cs="Proxima Nova" w:eastAsia="Proxima Nova" w:hAnsi="Proxima Nova"/>
-          <w:sz w:val="24"/>
-          <w:szCs w:val="24"/>
-        </w:rPr>
-      </w:pPr>
-      <w:r>
-        <w:rPr>
-          <w:rtl w:val="0"/>
-        </w:rPr>
-      </w:r>
-    </w:p>
-    <w:p>
-      <w:pPr>
-        <w:spacing w:after="140" w:lineRule="auto"/>
-        <w:ind w:left="420" w:firstLine="0"/>
-        <w:rPr>
-          <w:rFonts w:ascii="Proxima Nova" w:cs="Proxima Nova" w:eastAsia="Proxima Nova" w:hAnsi="Proxima Nova"/>
-          <w:sz w:val="24"/>
-          <w:szCs w:val="24"/>
-        </w:rPr>
-      </w:pPr>
-      <w:r>
-        <w:rPr>
-          <w:rtl w:val="0"/>
-        </w:rPr>
-      </w:r>
-    </w:p>
-    <w:p>
-      <w:pPr>
-        <w:spacing w:after="140" w:lineRule="auto"/>
-        <w:ind w:left="420" w:firstLine="0"/>
-        <w:rPr>
-          <w:rFonts w:ascii="Proxima Nova" w:cs="Proxima Nova" w:eastAsia="Proxima Nova" w:hAnsi="Proxima Nova"/>
-          <w:sz w:val="24"/>
-          <w:szCs w:val="24"/>
-        </w:rPr>
-      </w:pPr>
-      <w:r>
-        <w:rPr>
-          <w:rtl w:val="0"/>
-        </w:rPr>
-      </w:r>
-    </w:p>
-    <w:p>
-      <w:pPr>
-        <w:spacing w:after="140" w:lineRule="auto"/>
-        <w:ind w:left="420" w:firstLine="0"/>
-        <w:rPr>
-          <w:rFonts w:ascii="Proxima Nova" w:cs="Proxima Nova" w:eastAsia="Proxima Nova" w:hAnsi="Proxima Nova"/>
-          <w:sz w:val="24"/>
-          <w:szCs w:val="24"/>
-        </w:rPr>
-      </w:pPr>
-      <w:r>
-        <w:rPr>
-          <w:rtl w:val="0"/>
-        </w:rPr>
-      </w:r>
-    </w:p>
-    <w:p>
-      <w:pPr>
-        <w:spacing w:after="140" w:lineRule="auto"/>
-        <w:ind w:left="420" w:firstLine="0"/>
-        <w:rPr>
-          <w:rFonts w:ascii="Proxima Nova" w:cs="Proxima Nova" w:eastAsia="Proxima Nova" w:hAnsi="Proxima Nova"/>
-          <w:sz w:val="24"/>
-          <w:szCs w:val="24"/>
-        </w:rPr>
-      </w:pPr>
-      <w:r>
-        <w:rPr>
-          <w:rtl w:val="0"/>
-        </w:rPr>
-      </w:r>
-    </w:p>
-    <w:p>
-      <w:pPr>
-        <w:spacing w:after="140" w:lineRule="auto"/>
-        <w:ind w:left="420" w:firstLine="0"/>
-        <w:rPr>
-          <w:rFonts w:ascii="Proxima Nova" w:cs="Proxima Nova" w:eastAsia="Proxima Nova" w:hAnsi="Proxima Nova"/>
-          <w:sz w:val="24"/>
-          <w:szCs w:val="24"/>
-        </w:rPr>
-      </w:pPr>
-      <w:r>
-        <w:rPr>
-          <w:rtl w:val="0"/>
-        </w:rPr>
-      </w:r>
-    </w:p>
-    <w:p>
-      <w:pPr>
-        <w:spacing w:after="140" w:lineRule="auto"/>
-        <w:ind w:left="420" w:firstLine="0"/>
-        <w:rPr>
-          <w:rFonts w:ascii="Proxima Nova" w:cs="Proxima Nova" w:eastAsia="Proxima Nova" w:hAnsi="Proxima Nova"/>
-          <w:sz w:val="24"/>
-          <w:szCs w:val="24"/>
-        </w:rPr>
-      </w:pPr>
-      <w:r>
-        <w:rPr>
-          <w:rtl w:val="0"/>
-        </w:rPr>
-      </w:r>
-    </w:p>
-    <w:p>
-      <w:pPr>
-        <w:spacing w:after="140" w:lineRule="auto"/>
-        <w:ind w:left="420" w:firstLine="0"/>
-        <w:rPr>
-          <w:rFonts w:ascii="Proxima Nova" w:cs="Proxima Nova" w:eastAsia="Proxima Nova" w:hAnsi="Proxima Nova"/>
-          <w:sz w:val="24"/>
-          <w:szCs w:val="24"/>
-        </w:rPr>
-      </w:pPr>
-      <w:r>
-        <w:rPr>
-          <w:rtl w:val="0"/>
-        </w:rPr>
-      </w:r>
-    </w:p>
-    <w:p>
-      <w:pPr>
-        <w:spacing w:after="140" w:lineRule="auto"/>
-        <w:ind w:left="420" w:firstLine="0"/>
-        <w:rPr>
-          <w:rFonts w:ascii="Proxima Nova" w:cs="Proxima Nova" w:eastAsia="Proxima Nova" w:hAnsi="Proxima Nova"/>
-          <w:sz w:val="24"/>
-          <w:szCs w:val="24"/>
-        </w:rPr>
-      </w:pPr>
-      <w:r>
-        <w:rPr>
-          <w:rtl w:val="0"/>
-        </w:rPr>
-      </w:r>
-    </w:p>
-    <w:p>
-      <w:pPr>
-        <w:spacing w:after="140" w:lineRule="auto"/>
-        <w:ind w:left="420" w:firstLine="0"/>
-        <w:rPr>
-          <w:rFonts w:ascii="Proxima Nova" w:cs="Proxima Nova" w:eastAsia="Proxima Nova" w:hAnsi="Proxima Nova"/>
-          <w:sz w:val="24"/>
-          <w:szCs w:val="24"/>
-        </w:rPr>
-      </w:pPr>
-      <w:r>
-        <w:rPr>
-          <w:rtl w:val="0"/>
-        </w:rPr>
-      </w:r>
-    </w:p>
-    <w:p>
-      <w:pPr>
-        <w:spacing w:after="200" w:before="300" w:lineRule="auto"/>
-        <w:rPr/>
-      </w:pPr>
+      <w:r>
+        <w:br w:type="page"/>
+      </w:r>
       <w:r>
         <w:rPr>
           <w:rtl w:val="0"/>
@@ -3997,8 +2634,6 @@
         <w:ind w:left="425.19685039370086" w:firstLine="0"/>
         <w:rPr>
           <w:rFonts w:ascii="Proxima Nova" w:cs="Proxima Nova" w:eastAsia="Proxima Nova" w:hAnsi="Proxima Nova"/>
-          <w:sz w:val="24"/>
-          <w:szCs w:val="24"/>
         </w:rPr>
       </w:pPr>
       <w:r>
@@ -4230,8 +2865,6 @@
         <w:ind w:left="420" w:firstLine="0"/>
         <w:rPr>
           <w:rFonts w:ascii="Proxima Nova" w:cs="Proxima Nova" w:eastAsia="Proxima Nova" w:hAnsi="Proxima Nova"/>
-          <w:sz w:val="24"/>
-          <w:szCs w:val="24"/>
         </w:rPr>
       </w:pPr>
       <w:r>
@@ -4264,11 +2897,7 @@
       <w:pPr>
         <w:spacing w:after="140" w:lineRule="auto"/>
         <w:ind w:left="420" w:firstLine="0"/>
-        <w:rPr>
-          <w:rFonts w:ascii="Proxima Nova" w:cs="Proxima Nova" w:eastAsia="Proxima Nova" w:hAnsi="Proxima Nova"/>
-          <w:sz w:val="24"/>
-          <w:szCs w:val="24"/>
-        </w:rPr>
+        <w:rPr/>
       </w:pPr>
       <w:r>
         <w:rPr>
@@ -4279,209 +2908,9 @@
         </w:rPr>
         <w:t xml:space="preserve">{/show_whyChooseUs}</w:t>
       </w:r>
-    </w:p>
-    <w:p>
-      <w:pPr>
-        <w:spacing w:after="140" w:lineRule="auto"/>
-        <w:ind w:left="420" w:firstLine="0"/>
-        <w:rPr>
-          <w:rFonts w:ascii="Proxima Nova" w:cs="Proxima Nova" w:eastAsia="Proxima Nova" w:hAnsi="Proxima Nova"/>
-          <w:sz w:val="24"/>
-          <w:szCs w:val="24"/>
-        </w:rPr>
-      </w:pPr>
-      <w:r>
-        <w:rPr>
-          <w:rtl w:val="0"/>
-        </w:rPr>
-      </w:r>
-    </w:p>
-    <w:p>
-      <w:pPr>
-        <w:spacing w:after="140" w:lineRule="auto"/>
-        <w:ind w:left="420" w:firstLine="0"/>
-        <w:rPr>
-          <w:rFonts w:ascii="Proxima Nova" w:cs="Proxima Nova" w:eastAsia="Proxima Nova" w:hAnsi="Proxima Nova"/>
-          <w:sz w:val="24"/>
-          <w:szCs w:val="24"/>
-        </w:rPr>
-      </w:pPr>
-      <w:r>
-        <w:rPr>
-          <w:rtl w:val="0"/>
-        </w:rPr>
-      </w:r>
-    </w:p>
-    <w:p>
-      <w:pPr>
-        <w:spacing w:after="140" w:lineRule="auto"/>
-        <w:ind w:left="420" w:firstLine="0"/>
-        <w:rPr>
-          <w:rFonts w:ascii="Proxima Nova" w:cs="Proxima Nova" w:eastAsia="Proxima Nova" w:hAnsi="Proxima Nova"/>
-          <w:sz w:val="24"/>
-          <w:szCs w:val="24"/>
-        </w:rPr>
-      </w:pPr>
-      <w:r>
-        <w:rPr>
-          <w:rtl w:val="0"/>
-        </w:rPr>
-      </w:r>
-    </w:p>
-    <w:p>
-      <w:pPr>
-        <w:spacing w:after="140" w:lineRule="auto"/>
-        <w:ind w:left="420" w:firstLine="0"/>
-        <w:rPr>
-          <w:rFonts w:ascii="Proxima Nova" w:cs="Proxima Nova" w:eastAsia="Proxima Nova" w:hAnsi="Proxima Nova"/>
-          <w:sz w:val="24"/>
-          <w:szCs w:val="24"/>
-        </w:rPr>
-      </w:pPr>
-      <w:r>
-        <w:rPr>
-          <w:rtl w:val="0"/>
-        </w:rPr>
-      </w:r>
-    </w:p>
-    <w:p>
-      <w:pPr>
-        <w:spacing w:after="140" w:lineRule="auto"/>
-        <w:ind w:left="420" w:firstLine="0"/>
-        <w:rPr>
-          <w:rFonts w:ascii="Proxima Nova" w:cs="Proxima Nova" w:eastAsia="Proxima Nova" w:hAnsi="Proxima Nova"/>
-          <w:sz w:val="24"/>
-          <w:szCs w:val="24"/>
-        </w:rPr>
-      </w:pPr>
-      <w:r>
-        <w:rPr>
-          <w:rtl w:val="0"/>
-        </w:rPr>
-      </w:r>
-    </w:p>
-    <w:p>
-      <w:pPr>
-        <w:spacing w:after="140" w:lineRule="auto"/>
-        <w:ind w:left="420" w:firstLine="0"/>
-        <w:rPr>
-          <w:rFonts w:ascii="Proxima Nova" w:cs="Proxima Nova" w:eastAsia="Proxima Nova" w:hAnsi="Proxima Nova"/>
-          <w:sz w:val="24"/>
-          <w:szCs w:val="24"/>
-        </w:rPr>
-      </w:pPr>
-      <w:r>
-        <w:rPr>
-          <w:rtl w:val="0"/>
-        </w:rPr>
-      </w:r>
-    </w:p>
-    <w:p>
-      <w:pPr>
-        <w:spacing w:after="140" w:lineRule="auto"/>
-        <w:ind w:left="420" w:firstLine="0"/>
-        <w:rPr>
-          <w:rFonts w:ascii="Proxima Nova" w:cs="Proxima Nova" w:eastAsia="Proxima Nova" w:hAnsi="Proxima Nova"/>
-          <w:sz w:val="24"/>
-          <w:szCs w:val="24"/>
-        </w:rPr>
-      </w:pPr>
-      <w:r>
-        <w:rPr>
-          <w:rtl w:val="0"/>
-        </w:rPr>
-      </w:r>
-    </w:p>
-    <w:p>
-      <w:pPr>
-        <w:spacing w:after="140" w:lineRule="auto"/>
-        <w:ind w:left="420" w:firstLine="0"/>
-        <w:rPr>
-          <w:rFonts w:ascii="Proxima Nova" w:cs="Proxima Nova" w:eastAsia="Proxima Nova" w:hAnsi="Proxima Nova"/>
-          <w:sz w:val="24"/>
-          <w:szCs w:val="24"/>
-        </w:rPr>
-      </w:pPr>
-      <w:r>
-        <w:rPr>
-          <w:rtl w:val="0"/>
-        </w:rPr>
-      </w:r>
-    </w:p>
-    <w:p>
-      <w:pPr>
-        <w:spacing w:after="140" w:lineRule="auto"/>
-        <w:ind w:left="420" w:firstLine="0"/>
-        <w:rPr>
-          <w:rFonts w:ascii="Proxima Nova" w:cs="Proxima Nova" w:eastAsia="Proxima Nova" w:hAnsi="Proxima Nova"/>
-          <w:sz w:val="24"/>
-          <w:szCs w:val="24"/>
-        </w:rPr>
-      </w:pPr>
-      <w:r>
-        <w:rPr>
-          <w:rtl w:val="0"/>
-        </w:rPr>
-      </w:r>
-    </w:p>
-    <w:p>
-      <w:pPr>
-        <w:spacing w:after="140" w:lineRule="auto"/>
-        <w:ind w:left="420" w:firstLine="0"/>
-        <w:rPr>
-          <w:rFonts w:ascii="Proxima Nova" w:cs="Proxima Nova" w:eastAsia="Proxima Nova" w:hAnsi="Proxima Nova"/>
-          <w:sz w:val="24"/>
-          <w:szCs w:val="24"/>
-        </w:rPr>
-      </w:pPr>
-      <w:r>
-        <w:rPr>
-          <w:rtl w:val="0"/>
-        </w:rPr>
-      </w:r>
-    </w:p>
-    <w:p>
-      <w:pPr>
-        <w:spacing w:after="140" w:lineRule="auto"/>
-        <w:ind w:left="420" w:firstLine="0"/>
-        <w:rPr>
-          <w:rFonts w:ascii="Proxima Nova" w:cs="Proxima Nova" w:eastAsia="Proxima Nova" w:hAnsi="Proxima Nova"/>
-          <w:sz w:val="24"/>
-          <w:szCs w:val="24"/>
-        </w:rPr>
-      </w:pPr>
-      <w:r>
-        <w:rPr>
-          <w:rtl w:val="0"/>
-        </w:rPr>
-      </w:r>
-    </w:p>
-    <w:p>
-      <w:pPr>
-        <w:spacing w:after="140" w:lineRule="auto"/>
-        <w:ind w:left="420" w:firstLine="0"/>
-        <w:rPr>
-          <w:rFonts w:ascii="Proxima Nova" w:cs="Proxima Nova" w:eastAsia="Proxima Nova" w:hAnsi="Proxima Nova"/>
-          <w:sz w:val="24"/>
-          <w:szCs w:val="24"/>
-        </w:rPr>
-      </w:pPr>
-      <w:r>
-        <w:rPr>
-          <w:rtl w:val="0"/>
-        </w:rPr>
-      </w:r>
-    </w:p>
-    <w:p>
-      <w:pPr>
-        <w:spacing w:after="140" w:lineRule="auto"/>
-        <w:ind w:left="0" w:firstLine="0"/>
-        <w:rPr>
-          <w:rFonts w:ascii="Proxima Nova" w:cs="Proxima Nova" w:eastAsia="Proxima Nova" w:hAnsi="Proxima Nova"/>
-          <w:sz w:val="24"/>
-          <w:szCs w:val="24"/>
-        </w:rPr>
-      </w:pPr>
+      <w:r>
+        <w:br w:type="page"/>
+      </w:r>
       <w:r>
         <w:rPr>
           <w:rtl w:val="0"/>
@@ -4663,8 +3092,6 @@
         <w:ind w:left="425.19685039370086" w:firstLine="0"/>
         <w:rPr>
           <w:rFonts w:ascii="Proxima Nova" w:cs="Proxima Nova" w:eastAsia="Proxima Nova" w:hAnsi="Proxima Nova"/>
-          <w:sz w:val="24"/>
-          <w:szCs w:val="24"/>
         </w:rPr>
       </w:pPr>
       <w:r>
@@ -4697,11 +3124,7 @@
       <w:pPr>
         <w:spacing w:after="140" w:lineRule="auto"/>
         <w:ind w:left="425.19685039370086" w:firstLine="0"/>
-        <w:rPr>
-          <w:rFonts w:ascii="Proxima Nova" w:cs="Proxima Nova" w:eastAsia="Proxima Nova" w:hAnsi="Proxima Nova"/>
-          <w:sz w:val="24"/>
-          <w:szCs w:val="24"/>
-        </w:rPr>
+        <w:rPr/>
       </w:pPr>
       <w:r>
         <w:rPr>
@@ -4712,130 +3135,9 @@
         </w:rPr>
         <w:t xml:space="preserve">{/show_assumptions}</w:t>
       </w:r>
-    </w:p>
-    <w:p>
-      <w:pPr>
-        <w:rPr/>
-      </w:pPr>
-      <w:r>
-        <w:rPr>
-          <w:rtl w:val="0"/>
-        </w:rPr>
-      </w:r>
-    </w:p>
-    <w:p>
-      <w:pPr>
-        <w:rPr/>
-      </w:pPr>
-      <w:r>
-        <w:rPr>
-          <w:rtl w:val="0"/>
-        </w:rPr>
-        <w:br w:type="textWrapping"/>
-        <w:br w:type="textWrapping"/>
-        <w:br w:type="textWrapping"/>
-        <w:br w:type="textWrapping"/>
-        <w:br w:type="textWrapping"/>
-        <w:br w:type="textWrapping"/>
-        <w:br w:type="textWrapping"/>
-        <w:br w:type="textWrapping"/>
-        <w:br w:type="textWrapping"/>
-        <w:br w:type="textWrapping"/>
-        <w:br w:type="textWrapping"/>
-        <w:br w:type="textWrapping"/>
-        <w:br w:type="textWrapping"/>
-        <w:br w:type="textWrapping"/>
-        <w:br w:type="textWrapping"/>
-        <w:br w:type="textWrapping"/>
-        <w:br w:type="textWrapping"/>
-        <w:br w:type="textWrapping"/>
-        <w:br w:type="textWrapping"/>
-        <w:br w:type="textWrapping"/>
-        <w:br w:type="textWrapping"/>
-        <w:br w:type="textWrapping"/>
-        <w:br w:type="textWrapping"/>
-        <w:br w:type="textWrapping"/>
-        <w:br w:type="textWrapping"/>
-        <w:br w:type="textWrapping"/>
-        <w:br w:type="textWrapping"/>
-        <w:br w:type="textWrapping"/>
-        <w:br w:type="textWrapping"/>
-      </w:r>
-    </w:p>
-    <w:p>
-      <w:pPr>
-        <w:rPr/>
-      </w:pPr>
-      <w:r>
-        <w:rPr>
-          <w:rtl w:val="0"/>
-        </w:rPr>
-      </w:r>
-    </w:p>
-    <w:p>
-      <w:pPr>
-        <w:rPr/>
-      </w:pPr>
-      <w:r>
-        <w:rPr>
-          <w:rtl w:val="0"/>
-        </w:rPr>
-      </w:r>
-    </w:p>
-    <w:p>
-      <w:pPr>
-        <w:rPr/>
-      </w:pPr>
-      <w:r>
-        <w:rPr>
-          <w:rtl w:val="0"/>
-        </w:rPr>
-      </w:r>
-    </w:p>
-    <w:p>
-      <w:pPr>
-        <w:rPr/>
-      </w:pPr>
-      <w:r>
-        <w:rPr>
-          <w:rtl w:val="0"/>
-        </w:rPr>
-      </w:r>
-    </w:p>
-    <w:p>
-      <w:pPr>
-        <w:rPr/>
-      </w:pPr>
-      <w:r>
-        <w:rPr>
-          <w:rtl w:val="0"/>
-        </w:rPr>
-      </w:r>
-    </w:p>
-    <w:p>
-      <w:pPr>
-        <w:rPr/>
-      </w:pPr>
-      <w:r>
-        <w:rPr>
-          <w:rtl w:val="0"/>
-        </w:rPr>
-      </w:r>
-    </w:p>
-    <w:p>
-      <w:pPr>
-        <w:rPr/>
-      </w:pPr>
-      <w:r>
-        <w:rPr>
-          <w:rtl w:val="0"/>
-        </w:rPr>
-      </w:r>
-    </w:p>
-    <w:p>
-      <w:pPr>
-        <w:rPr/>
-      </w:pPr>
+      <w:r>
+        <w:br w:type="page"/>
+      </w:r>
       <w:r>
         <w:rPr>
           <w:rtl w:val="0"/>
@@ -5013,8 +3315,6 @@
         <w:ind w:left="425.19685039370086" w:firstLine="0"/>
         <w:rPr>
           <w:rFonts w:ascii="Proxima Nova" w:cs="Proxima Nova" w:eastAsia="Proxima Nova" w:hAnsi="Proxima Nova"/>
-          <w:sz w:val="24"/>
-          <w:szCs w:val="24"/>
         </w:rPr>
       </w:pPr>
       <w:r>
@@ -5062,114 +3362,9 @@
         </w:rPr>
         <w:t xml:space="preserve">{/show_outOfScope}</w:t>
       </w:r>
-    </w:p>
-    <w:p>
-      <w:pPr>
-        <w:rPr/>
-      </w:pPr>
-      <w:r>
-        <w:rPr>
-          <w:rtl w:val="0"/>
-        </w:rPr>
-        <w:br w:type="textWrapping"/>
-        <w:br w:type="textWrapping"/>
-        <w:br w:type="textWrapping"/>
-        <w:br w:type="textWrapping"/>
-        <w:br w:type="textWrapping"/>
-        <w:br w:type="textWrapping"/>
-        <w:br w:type="textWrapping"/>
-        <w:br w:type="textWrapping"/>
-        <w:br w:type="textWrapping"/>
-        <w:br w:type="textWrapping"/>
-        <w:br w:type="textWrapping"/>
-        <w:br w:type="textWrapping"/>
-        <w:br w:type="textWrapping"/>
-        <w:br w:type="textWrapping"/>
-        <w:br w:type="textWrapping"/>
-        <w:br w:type="textWrapping"/>
-        <w:br w:type="textWrapping"/>
-        <w:br w:type="textWrapping"/>
-        <w:br w:type="textWrapping"/>
-        <w:br w:type="textWrapping"/>
-        <w:br w:type="textWrapping"/>
-        <w:br w:type="textWrapping"/>
-        <w:br w:type="textWrapping"/>
-        <w:br w:type="textWrapping"/>
-        <w:br w:type="textWrapping"/>
-        <w:br w:type="textWrapping"/>
-        <w:br w:type="textWrapping"/>
-        <w:br w:type="textWrapping"/>
-        <w:br w:type="textWrapping"/>
-        <w:br w:type="textWrapping"/>
-        <w:br w:type="textWrapping"/>
-      </w:r>
-    </w:p>
-    <w:p>
-      <w:pPr>
-        <w:rPr/>
-      </w:pPr>
-      <w:r>
-        <w:rPr>
-          <w:rtl w:val="0"/>
-        </w:rPr>
-      </w:r>
-    </w:p>
-    <w:p>
-      <w:pPr>
-        <w:rPr/>
-      </w:pPr>
-      <w:r>
-        <w:rPr>
-          <w:rtl w:val="0"/>
-        </w:rPr>
-      </w:r>
-    </w:p>
-    <w:p>
-      <w:pPr>
-        <w:rPr/>
-      </w:pPr>
-      <w:r>
-        <w:rPr>
-          <w:rtl w:val="0"/>
-        </w:rPr>
-      </w:r>
-    </w:p>
-    <w:p>
-      <w:pPr>
-        <w:rPr/>
-      </w:pPr>
-      <w:r>
-        <w:rPr>
-          <w:rtl w:val="0"/>
-        </w:rPr>
-      </w:r>
-    </w:p>
-    <w:p>
-      <w:pPr>
-        <w:rPr/>
-      </w:pPr>
-      <w:r>
-        <w:rPr>
-          <w:rtl w:val="0"/>
-        </w:rPr>
-      </w:r>
-    </w:p>
-    <w:p>
-      <w:pPr>
-        <w:spacing w:after="140" w:lineRule="auto"/>
-        <w:rPr/>
-      </w:pPr>
-      <w:r>
-        <w:rPr>
-          <w:rtl w:val="0"/>
-        </w:rPr>
-      </w:r>
-    </w:p>
-    <w:p>
-      <w:pPr>
-        <w:spacing w:after="140" w:lineRule="auto"/>
-        <w:rPr/>
-      </w:pPr>
+      <w:r>
+        <w:br w:type="page"/>
+      </w:r>
       <w:r>
         <w:rPr>
           <w:rtl w:val="0"/>
@@ -5180,8 +3375,9 @@
       <w:pPr>
         <w:pStyle w:val="Heading2"/>
         <w:spacing w:after="140" w:lineRule="auto"/>
-        <w:rPr>
-          <w:rFonts w:ascii="Arial" w:cs="Arial" w:eastAsia="Arial" w:hAnsi="Arial"/>
+        <w:ind w:left="425.19685039370086" w:firstLine="0"/>
+        <w:rPr>
+          <w:rFonts w:ascii="Maven Pro" w:cs="Maven Pro" w:eastAsia="Maven Pro" w:hAnsi="Maven Pro"/>
           <w:b w:val="1"/>
           <w:bCs w:val="1"/>
           <w:color w:val="000000"/>
@@ -5189,11 +3385,11 @@
           <w:szCs w:val="32"/>
         </w:rPr>
       </w:pPr>
-      <w:bookmarkStart w:colFirst="0" w:colLast="0" w:name="_s6g1n2u0cbn3" w:id="15"/>
+      <w:bookmarkStart w:colFirst="0" w:colLast="0" w:name="_l29m704wjmtm" w:id="15"/>
       <w:bookmarkEnd w:id="15"/>
       <w:r>
         <w:rPr>
-          <w:rFonts w:ascii="Arial" w:cs="Arial" w:eastAsia="Arial" w:hAnsi="Arial"/>
+          <w:rFonts w:ascii="Maven Pro" w:cs="Maven Pro" w:eastAsia="Maven Pro" w:hAnsi="Maven Pro"/>
           <w:b w:val="1"/>
           <w:bCs w:val="1"/>
           <w:color w:val="000000"/>
@@ -5630,166 +3826,8 @@
         <w:t xml:space="preserve">{/show_milestones}</w:t>
       </w:r>
       <w:r>
-        <w:rPr>
-          <w:rtl w:val="0"/>
-        </w:rPr>
-        <w:br w:type="textWrapping"/>
-        <w:br w:type="textWrapping"/>
-        <w:br w:type="textWrapping"/>
-        <w:br w:type="textWrapping"/>
-        <w:br w:type="textWrapping"/>
-        <w:br w:type="textWrapping"/>
-        <w:br w:type="textWrapping"/>
-        <w:br w:type="textWrapping"/>
-        <w:br w:type="textWrapping"/>
-        <w:br w:type="textWrapping"/>
-        <w:br w:type="textWrapping"/>
-        <w:br w:type="textWrapping"/>
-        <w:br w:type="textWrapping"/>
-        <w:br w:type="textWrapping"/>
-        <w:br w:type="textWrapping"/>
-        <w:br w:type="textWrapping"/>
-        <w:br w:type="textWrapping"/>
-        <w:br w:type="textWrapping"/>
-        <w:br w:type="textWrapping"/>
-        <w:br w:type="textWrapping"/>
-        <w:br w:type="textWrapping"/>
-        <w:br w:type="textWrapping"/>
-        <w:br w:type="textWrapping"/>
-        <w:br w:type="textWrapping"/>
-        <w:br w:type="textWrapping"/>
-        <w:br w:type="textWrapping"/>
-        <w:br w:type="textWrapping"/>
-        <w:br w:type="textWrapping"/>
-        <w:br w:type="textWrapping"/>
-        <w:br w:type="textWrapping"/>
-        <w:br w:type="textWrapping"/>
-      </w:r>
-    </w:p>
-    <w:p>
-      <w:pPr>
-        <w:rPr/>
-      </w:pPr>
-      <w:r>
-        <w:rPr>
-          <w:rtl w:val="0"/>
-        </w:rPr>
-      </w:r>
-    </w:p>
-    <w:p>
-      <w:pPr>
-        <w:rPr/>
-      </w:pPr>
-      <w:r>
-        <w:rPr>
-          <w:rtl w:val="0"/>
-        </w:rPr>
-      </w:r>
-    </w:p>
-    <w:p>
-      <w:pPr>
-        <w:rPr/>
-      </w:pPr>
-      <w:r>
-        <w:rPr>
-          <w:rtl w:val="0"/>
-        </w:rPr>
-      </w:r>
-    </w:p>
-    <w:p>
-      <w:pPr>
-        <w:rPr/>
-      </w:pPr>
-      <w:r>
-        <w:rPr>
-          <w:rtl w:val="0"/>
-        </w:rPr>
-      </w:r>
-    </w:p>
-    <w:p>
-      <w:pPr>
-        <w:rPr/>
-      </w:pPr>
-      <w:r>
-        <w:rPr>
-          <w:rtl w:val="0"/>
-        </w:rPr>
-      </w:r>
-    </w:p>
-    <w:p>
-      <w:pPr>
-        <w:rPr/>
-      </w:pPr>
-      <w:r>
-        <w:rPr>
-          <w:rtl w:val="0"/>
-        </w:rPr>
-      </w:r>
-    </w:p>
-    <w:p>
-      <w:pPr>
-        <w:rPr/>
-      </w:pPr>
-      <w:r>
-        <w:rPr>
-          <w:rtl w:val="0"/>
-        </w:rPr>
-      </w:r>
-    </w:p>
-    <w:p>
-      <w:pPr>
-        <w:rPr/>
-      </w:pPr>
-      <w:r>
-        <w:rPr>
-          <w:rtl w:val="0"/>
-        </w:rPr>
-      </w:r>
-    </w:p>
-    <w:p>
-      <w:pPr>
-        <w:rPr/>
-      </w:pPr>
-      <w:r>
-        <w:rPr>
-          <w:rtl w:val="0"/>
-        </w:rPr>
-      </w:r>
-    </w:p>
-    <w:p>
-      <w:pPr>
-        <w:rPr/>
-      </w:pPr>
-      <w:r>
-        <w:rPr>
-          <w:rtl w:val="0"/>
-        </w:rPr>
-      </w:r>
-    </w:p>
-    <w:p>
-      <w:pPr>
-        <w:rPr/>
-      </w:pPr>
-      <w:r>
-        <w:rPr>
-          <w:rtl w:val="0"/>
-        </w:rPr>
-      </w:r>
-    </w:p>
-    <w:p>
-      <w:pPr>
-        <w:rPr/>
-      </w:pPr>
-      <w:r>
-        <w:rPr>
-          <w:rtl w:val="0"/>
-        </w:rPr>
-      </w:r>
-    </w:p>
-    <w:p>
-      <w:pPr>
-        <w:rPr/>
-      </w:pPr>
+        <w:br w:type="page"/>
+      </w:r>
       <w:r>
         <w:rPr>
           <w:rtl w:val="0"/>
@@ -5799,8 +3837,10 @@
     <w:p>
       <w:pPr>
         <w:pStyle w:val="Heading2"/>
-        <w:rPr>
-          <w:rFonts w:ascii="Arial" w:cs="Arial" w:eastAsia="Arial" w:hAnsi="Arial"/>
+        <w:spacing w:before="200" w:lineRule="auto"/>
+        <w:ind w:left="420" w:firstLine="0"/>
+        <w:rPr>
+          <w:rFonts w:ascii="Maven Pro" w:cs="Maven Pro" w:eastAsia="Maven Pro" w:hAnsi="Maven Pro"/>
           <w:b w:val="1"/>
           <w:bCs w:val="1"/>
           <w:color w:val="000000"/>
@@ -5808,11 +3848,11 @@
           <w:szCs w:val="32"/>
         </w:rPr>
       </w:pPr>
-      <w:bookmarkStart w:colFirst="0" w:colLast="0" w:name="_ifw8m628egut" w:id="16"/>
+      <w:bookmarkStart w:colFirst="0" w:colLast="0" w:name="_7kxuklne32ze" w:id="16"/>
       <w:bookmarkEnd w:id="16"/>
       <w:r>
         <w:rPr>
-          <w:rFonts w:ascii="Arial" w:cs="Arial" w:eastAsia="Arial" w:hAnsi="Arial"/>
+          <w:rFonts w:ascii="Maven Pro" w:cs="Maven Pro" w:eastAsia="Maven Pro" w:hAnsi="Maven Pro"/>
           <w:b w:val="1"/>
           <w:bCs w:val="1"/>
           <w:color w:val="000000"/>
@@ -5911,13 +3951,7 @@
       <w:pPr>
         <w:spacing w:after="0" w:before="0" w:lineRule="auto"/>
         <w:ind w:left="425.19685039370086" w:firstLine="0"/>
-        <w:rPr>
-          <w:rFonts w:ascii="Proxima Nova" w:cs="Proxima Nova" w:eastAsia="Proxima Nova" w:hAnsi="Proxima Nova"/>
-          <w:b w:val="1"/>
-          <w:bCs w:val="1"/>
-          <w:sz w:val="32"/>
-          <w:szCs w:val="32"/>
-        </w:rPr>
+        <w:rPr/>
       </w:pPr>
       <w:r>
         <w:rPr>
@@ -5929,374 +3963,8 @@
         <w:t xml:space="preserve">{/show_clientQuestions}</w:t>
       </w:r>
       <w:r>
-        <w:rPr>
-          <w:rtl w:val="0"/>
-        </w:rPr>
-      </w:r>
-    </w:p>
-    <w:p>
-      <w:pPr>
-        <w:rPr/>
-      </w:pPr>
-      <w:r>
-        <w:rPr>
-          <w:rtl w:val="0"/>
-        </w:rPr>
-      </w:r>
-    </w:p>
-    <w:p>
-      <w:pPr>
-        <w:rPr/>
-      </w:pPr>
-      <w:r>
-        <w:rPr>
-          <w:rtl w:val="0"/>
-        </w:rPr>
-      </w:r>
-    </w:p>
-    <w:p>
-      <w:pPr>
-        <w:rPr/>
-      </w:pPr>
-      <w:r>
-        <w:rPr>
-          <w:rtl w:val="0"/>
-        </w:rPr>
-      </w:r>
-    </w:p>
-    <w:p>
-      <w:pPr>
-        <w:rPr/>
-      </w:pPr>
-      <w:r>
-        <w:rPr>
-          <w:rtl w:val="0"/>
-        </w:rPr>
-      </w:r>
-    </w:p>
-    <w:p>
-      <w:pPr>
-        <w:rPr/>
-      </w:pPr>
-      <w:r>
-        <w:rPr>
-          <w:rtl w:val="0"/>
-        </w:rPr>
-      </w:r>
-    </w:p>
-    <w:p>
-      <w:pPr>
-        <w:rPr/>
-      </w:pPr>
-      <w:r>
-        <w:rPr>
-          <w:rtl w:val="0"/>
-        </w:rPr>
-      </w:r>
-    </w:p>
-    <w:p>
-      <w:pPr>
-        <w:rPr/>
-      </w:pPr>
-      <w:r>
-        <w:rPr>
-          <w:rtl w:val="0"/>
-        </w:rPr>
-      </w:r>
-    </w:p>
-    <w:p>
-      <w:pPr>
-        <w:rPr/>
-      </w:pPr>
-      <w:r>
-        <w:rPr>
-          <w:rtl w:val="0"/>
-        </w:rPr>
-      </w:r>
-    </w:p>
-    <w:p>
-      <w:pPr>
-        <w:rPr/>
-      </w:pPr>
-      <w:r>
-        <w:rPr>
-          <w:rtl w:val="0"/>
-        </w:rPr>
-      </w:r>
-    </w:p>
-    <w:p>
-      <w:pPr>
-        <w:rPr/>
-      </w:pPr>
-      <w:r>
-        <w:rPr>
-          <w:rtl w:val="0"/>
-        </w:rPr>
-      </w:r>
-    </w:p>
-    <w:p>
-      <w:pPr>
-        <w:rPr/>
-      </w:pPr>
-      <w:r>
-        <w:rPr>
-          <w:rtl w:val="0"/>
-        </w:rPr>
-      </w:r>
-    </w:p>
-    <w:p>
-      <w:pPr>
-        <w:rPr/>
-      </w:pPr>
-      <w:r>
-        <w:rPr>
-          <w:rtl w:val="0"/>
-        </w:rPr>
-      </w:r>
-    </w:p>
-    <w:p>
-      <w:pPr>
-        <w:rPr/>
-      </w:pPr>
-      <w:r>
-        <w:rPr>
-          <w:rtl w:val="0"/>
-        </w:rPr>
-      </w:r>
-    </w:p>
-    <w:p>
-      <w:pPr>
-        <w:rPr/>
-      </w:pPr>
-      <w:r>
-        <w:rPr>
-          <w:rtl w:val="0"/>
-        </w:rPr>
-      </w:r>
-    </w:p>
-    <w:p>
-      <w:pPr>
-        <w:rPr/>
-      </w:pPr>
-      <w:r>
-        <w:rPr>
-          <w:rtl w:val="0"/>
-        </w:rPr>
-      </w:r>
-    </w:p>
-    <w:p>
-      <w:pPr>
-        <w:rPr/>
-      </w:pPr>
-      <w:r>
-        <w:rPr>
-          <w:rtl w:val="0"/>
-        </w:rPr>
-      </w:r>
-    </w:p>
-    <w:p>
-      <w:pPr>
-        <w:rPr/>
-      </w:pPr>
-      <w:r>
-        <w:rPr>
-          <w:rtl w:val="0"/>
-        </w:rPr>
-      </w:r>
-    </w:p>
-    <w:p>
-      <w:pPr>
-        <w:rPr/>
-      </w:pPr>
-      <w:r>
-        <w:rPr>
-          <w:rtl w:val="0"/>
-        </w:rPr>
-      </w:r>
-    </w:p>
-    <w:p>
-      <w:pPr>
-        <w:rPr/>
-      </w:pPr>
-      <w:r>
-        <w:rPr>
-          <w:rtl w:val="0"/>
-        </w:rPr>
-      </w:r>
-    </w:p>
-    <w:p>
-      <w:pPr>
-        <w:rPr/>
-      </w:pPr>
-      <w:r>
-        <w:rPr>
-          <w:rtl w:val="0"/>
-        </w:rPr>
-      </w:r>
-    </w:p>
-    <w:p>
-      <w:pPr>
-        <w:rPr/>
-      </w:pPr>
-      <w:r>
-        <w:rPr>
-          <w:rtl w:val="0"/>
-        </w:rPr>
-      </w:r>
-    </w:p>
-    <w:p>
-      <w:pPr>
-        <w:rPr/>
-      </w:pPr>
-      <w:r>
-        <w:rPr>
-          <w:rtl w:val="0"/>
-        </w:rPr>
-      </w:r>
-    </w:p>
-    <w:p>
-      <w:pPr>
-        <w:rPr/>
-      </w:pPr>
-      <w:r>
-        <w:rPr>
-          <w:rtl w:val="0"/>
-        </w:rPr>
-      </w:r>
-    </w:p>
-    <w:p>
-      <w:pPr>
-        <w:rPr/>
-      </w:pPr>
-      <w:r>
-        <w:rPr>
-          <w:rtl w:val="0"/>
-        </w:rPr>
-      </w:r>
-    </w:p>
-    <w:p>
-      <w:pPr>
-        <w:rPr/>
-      </w:pPr>
-      <w:r>
-        <w:rPr>
-          <w:rtl w:val="0"/>
-        </w:rPr>
-      </w:r>
-    </w:p>
-    <w:p>
-      <w:pPr>
-        <w:rPr/>
-      </w:pPr>
-      <w:r>
-        <w:rPr>
-          <w:rtl w:val="0"/>
-        </w:rPr>
-      </w:r>
-    </w:p>
-    <w:p>
-      <w:pPr>
-        <w:rPr/>
-      </w:pPr>
-      <w:r>
-        <w:rPr>
-          <w:rtl w:val="0"/>
-        </w:rPr>
-        <w:br w:type="textWrapping"/>
-      </w:r>
-    </w:p>
-    <w:p>
-      <w:pPr>
-        <w:rPr/>
-      </w:pPr>
-      <w:r>
-        <w:rPr>
-          <w:rtl w:val="0"/>
-        </w:rPr>
-      </w:r>
-    </w:p>
-    <w:p>
-      <w:pPr>
-        <w:rPr/>
-      </w:pPr>
-      <w:r>
-        <w:rPr>
-          <w:rtl w:val="0"/>
-        </w:rPr>
-      </w:r>
-    </w:p>
-    <w:p>
-      <w:pPr>
-        <w:rPr/>
-      </w:pPr>
-      <w:r>
-        <w:rPr>
-          <w:rtl w:val="0"/>
-        </w:rPr>
-        <w:br w:type="textWrapping"/>
-      </w:r>
-    </w:p>
-    <w:p>
-      <w:pPr>
-        <w:rPr/>
-      </w:pPr>
-      <w:r>
-        <w:rPr>
-          <w:rtl w:val="0"/>
-        </w:rPr>
-        <w:br w:type="textWrapping"/>
-        <w:t xml:space="preserve"> </w:t>
-        <w:br w:type="textWrapping"/>
-        <w:br w:type="textWrapping"/>
-        <w:br w:type="textWrapping"/>
-        <w:br w:type="textWrapping"/>
-      </w:r>
-    </w:p>
-    <w:p>
-      <w:pPr>
-        <w:rPr/>
-      </w:pPr>
-      <w:r>
-        <w:rPr>
-          <w:rtl w:val="0"/>
-        </w:rPr>
-      </w:r>
-    </w:p>
-    <w:p>
-      <w:pPr>
-        <w:rPr/>
-      </w:pPr>
-      <w:r>
-        <w:rPr>
-          <w:rtl w:val="0"/>
-        </w:rPr>
-      </w:r>
-    </w:p>
-    <w:p>
-      <w:pPr>
-        <w:rPr/>
-      </w:pPr>
-      <w:r>
-        <w:rPr>
-          <w:rtl w:val="0"/>
-        </w:rPr>
-        <w:br w:type="textWrapping"/>
-      </w:r>
-    </w:p>
-    <w:p>
-      <w:pPr>
-        <w:rPr/>
-      </w:pPr>
-      <w:r>
-        <w:rPr>
-          <w:rtl w:val="0"/>
-        </w:rPr>
-      </w:r>
-    </w:p>
-    <w:p>
-      <w:pPr>
-        <w:rPr/>
-      </w:pPr>
+        <w:br w:type="page"/>
+      </w:r>
       <w:r>
         <w:rPr>
           <w:rtl w:val="0"/>
@@ -6319,7 +3987,7 @@
           <w:szCs w:val="32"/>
         </w:rPr>
       </w:pPr>
-      <w:bookmarkStart w:colFirst="0" w:colLast="0" w:name="_ymrf9jpsgt4" w:id="17"/>
+      <w:bookmarkStart w:colFirst="0" w:colLast="0" w:name="_cv1dk7ijkfcv" w:id="17"/>
       <w:bookmarkEnd w:id="17"/>
       <w:r>
         <w:rPr>
@@ -6380,8 +4048,6 @@
         <w:ind w:left="420" w:firstLine="0"/>
         <w:rPr>
           <w:rFonts w:ascii="Proxima Nova" w:cs="Proxima Nova" w:eastAsia="Proxima Nova" w:hAnsi="Proxima Nova"/>
-          <w:sz w:val="24"/>
-          <w:szCs w:val="24"/>
         </w:rPr>
       </w:pPr>
       <w:r>
@@ -6484,8 +4150,6 @@
         <w:ind w:left="420" w:firstLine="0"/>
         <w:rPr>
           <w:rFonts w:ascii="Proxima Nova" w:cs="Proxima Nova" w:eastAsia="Proxima Nova" w:hAnsi="Proxima Nova"/>
-          <w:sz w:val="24"/>
-          <w:szCs w:val="24"/>
         </w:rPr>
       </w:pPr>
       <w:r>
@@ -6681,8 +4345,6 @@
         <w:ind w:left="420" w:firstLine="0"/>
         <w:rPr>
           <w:rFonts w:ascii="Proxima Nova" w:cs="Proxima Nova" w:eastAsia="Proxima Nova" w:hAnsi="Proxima Nova"/>
-          <w:sz w:val="24"/>
-          <w:szCs w:val="24"/>
         </w:rPr>
       </w:pPr>
       <w:r>
@@ -6715,11 +4377,7 @@
       <w:pPr>
         <w:spacing w:after="140" w:lineRule="auto"/>
         <w:ind w:left="420" w:firstLine="0"/>
-        <w:rPr>
-          <w:rFonts w:ascii="Proxima Nova" w:cs="Proxima Nova" w:eastAsia="Proxima Nova" w:hAnsi="Proxima Nova"/>
-          <w:sz w:val="24"/>
-          <w:szCs w:val="24"/>
-        </w:rPr>
+        <w:rPr/>
       </w:pPr>
       <w:r>
         <w:rPr>
@@ -6730,62 +4388,6 @@
         </w:rPr>
         <w:t xml:space="preserve"> {/show_postLaunchSupport}</w:t>
       </w:r>
-    </w:p>
-    <w:p>
-      <w:pPr>
-        <w:spacing w:after="140" w:lineRule="auto"/>
-        <w:ind w:left="425.19685039370086" w:firstLine="0"/>
-        <w:rPr>
-          <w:rFonts w:ascii="Proxima Nova" w:cs="Proxima Nova" w:eastAsia="Proxima Nova" w:hAnsi="Proxima Nova"/>
-          <w:color w:val="1a2a3a"/>
-          <w:sz w:val="24"/>
-          <w:szCs w:val="24"/>
-        </w:rPr>
-      </w:pPr>
-      <w:r>
-        <w:rPr>
-          <w:rtl w:val="0"/>
-        </w:rPr>
-      </w:r>
-    </w:p>
-    <w:p>
-      <w:pPr>
-        <w:spacing w:after="140" w:lineRule="auto"/>
-        <w:ind w:left="425.19685039370086" w:firstLine="0"/>
-        <w:rPr>
-          <w:rFonts w:ascii="Proxima Nova" w:cs="Proxima Nova" w:eastAsia="Proxima Nova" w:hAnsi="Proxima Nova"/>
-          <w:color w:val="1a2a3a"/>
-          <w:sz w:val="24"/>
-          <w:szCs w:val="24"/>
-        </w:rPr>
-      </w:pPr>
-      <w:r>
-        <w:rPr>
-          <w:rtl w:val="0"/>
-        </w:rPr>
-      </w:r>
-    </w:p>
-    <w:p>
-      <w:pPr>
-        <w:spacing w:after="140" w:lineRule="auto"/>
-        <w:ind w:left="425.19685039370086" w:firstLine="0"/>
-        <w:rPr>
-          <w:rFonts w:ascii="Proxima Nova" w:cs="Proxima Nova" w:eastAsia="Proxima Nova" w:hAnsi="Proxima Nova"/>
-          <w:color w:val="1a2a3a"/>
-          <w:sz w:val="24"/>
-          <w:szCs w:val="24"/>
-        </w:rPr>
-      </w:pPr>
-      <w:r>
-        <w:rPr>
-          <w:rtl w:val="0"/>
-        </w:rPr>
-      </w:r>
-    </w:p>
-    <w:p>
-      <w:pPr>
-        <w:rPr/>
-      </w:pPr>
       <w:r>
         <w:rPr>
           <w:rtl w:val="0"/>

</xml_diff>